<commit_message>
Update Integration_Proposal: remove inbound webhook, clarify write-back
Manual ride push is intentional — dispatcher controls what enters the
queue. Removed 3.1 (RC webhook), updated executive summary to explain
the deliberate design, clarified 3.1 is now a write-back confirmation.

Co-Authored-By: Claude Opus 4.7 <noreply@anthropic.com>
</commit_message>
<xml_diff>
--- a/docs/Integration_Proposal.docx
+++ b/docs/Integration_Proposal.docx
@@ -45,7 +45,7 @@
           <w:sz w:val="20"/>
           <w:szCs w:val="20"/>
         </w:rPr>
-        <w:t xml:space="preserve">Version 1.0  |  May 2026  |  Confidential</w:t>
+        <w:t xml:space="preserve">Version 1.1  |  May 2026  |  Confidential</w:t>
       </w:r>
     </w:p>
     <w:p>
@@ -87,7 +87,7 @@
           <w:sz w:val="22"/>
           <w:szCs w:val="22"/>
         </w:rPr>
-        <w:t xml:space="preserve">We have built a WhatsApp AI Dispatch Agent — a FastAPI backend that automatically contacts drivers and suppliers via the WhatsApp Cloud API, ranks candidates using Claude AI, tracks acceptance, and escalates exceptions to a human dispatcher. The agent is fully operational and integrated with our internal systems.</w:t>
+        <w:t xml:space="preserve">We have built a WhatsApp AI Dispatch Agent — a FastAPI backend that automatically contacts drivers and suppliers via the WhatsApp Cloud API, ranks candidates using Claude AI, tracks acceptance, and escalates exceptions to a human dispatcher.</w:t>
       </w:r>
     </w:p>
     <w:p>
@@ -100,17 +100,12 @@
           <w:sz w:val="22"/>
           <w:szCs w:val="22"/>
         </w:rPr>
-        <w:t xml:space="preserve">What remains is a thin integration layer with your Ride Control platform so that:</w:t>
-      </w:r>
-    </w:p>
-    <w:p>
-      <w:pPr>
-        <w:pStyle w:val="ListParagraph"/>
-        <w:numPr>
-          <w:ilvl w:val="0"/>
-          <w:numId w:val="1"/>
-        </w:numPr>
-        <w:spacing w:after="40" w:before="40"/>
+        <w:t xml:space="preserve">The dispatcher manually selects which bookings to push into the agent queue. This is intentional: some bookings are handled by internal drivers outside the agent system, and the dispatcher needs full control over what the agent touches.</w:t>
+      </w:r>
+    </w:p>
+    <w:p>
+      <w:pPr>
+        <w:spacing w:after="80" w:before="80"/>
       </w:pPr>
       <w:r>
         <w:rPr>
@@ -118,43 +113,7 @@
           <w:sz w:val="22"/>
           <w:szCs w:val="22"/>
         </w:rPr>
-        <w:t xml:space="preserve">New bookings reach the agent automatically (webhook push).</w:t>
-      </w:r>
-    </w:p>
-    <w:p>
-      <w:pPr>
-        <w:pStyle w:val="ListParagraph"/>
-        <w:numPr>
-          <w:ilvl w:val="0"/>
-          <w:numId w:val="1"/>
-        </w:numPr>
-        <w:spacing w:after="40" w:before="40"/>
-      </w:pPr>
-      <w:r>
-        <w:rPr>
-          <w:rFonts w:ascii="Arial" w:cs="Arial" w:eastAsia="Arial" w:hAnsi="Arial"/>
-          <w:sz w:val="22"/>
-          <w:szCs w:val="22"/>
-        </w:rPr>
-        <w:t xml:space="preserve">The agent can write back to a booking (assign driver, add notes).</w:t>
-      </w:r>
-    </w:p>
-    <w:p>
-      <w:pPr>
-        <w:pStyle w:val="ListParagraph"/>
-        <w:numPr>
-          <w:ilvl w:val="0"/>
-          <w:numId w:val="1"/>
-        </w:numPr>
-        <w:spacing w:after="40" w:before="40"/>
-      </w:pPr>
-      <w:r>
-        <w:rPr>
-          <w:rFonts w:ascii="Arial" w:cs="Arial" w:eastAsia="Arial" w:hAnsi="Arial"/>
-          <w:sz w:val="22"/>
-          <w:szCs w:val="22"/>
-        </w:rPr>
-        <w:t xml:space="preserve">Drivers can officially approve their assignment via a Ride Control link.</w:t>
+        <w:t xml:space="preserve">What we need from Ride Control is a thin write-back layer — two existing API calls we are already making that need to be confirmed, and one new callback so that driver approvals made inside Ride Control are communicated back to our agent.</w:t>
       </w:r>
     </w:p>
     <w:p>
@@ -179,27 +138,6 @@
           <w:szCs w:val="28"/>
         </w:rPr>
         <w:t xml:space="preserve">2. What Already Works (No Ride Control Changes Needed)</w:t>
-      </w:r>
-    </w:p>
-    <w:p>
-      <w:pPr>
-        <w:spacing w:after="80" w:before="80"/>
-      </w:pPr>
-      <w:r>
-        <w:rPr>
-          <w:rFonts w:ascii="Arial" w:cs="Arial" w:eastAsia="Arial" w:hAnsi="Arial"/>
-          <w:sz w:val="22"/>
-          <w:szCs w:val="22"/>
-        </w:rPr>
-        <w:t xml:space="preserve">The following is fully implemented on our side and requires no Ride Control development:</w:t>
-      </w:r>
-    </w:p>
-    <w:p>
-      <w:pPr>
-        <w:spacing w:after="80" w:before="80"/>
-      </w:pPr>
-      <w:r>
-        <w:t xml:space="preserve"/>
       </w:r>
     </w:p>
     <w:tbl>
@@ -758,7 +696,7 @@
                 <w:sz w:val="20"/>
                 <w:szCs w:val="20"/>
               </w:rPr>
-              <w:t xml:space="preserve">Dispatcher dashboard (drag-and-drop, override, monitor)</w:t>
+              <w:t xml:space="preserve">Dispatcher dashboard (drag-and-drop queue, override, monitor)</w:t>
             </w:r>
           </w:p>
         </w:tc>
@@ -854,6 +792,70 @@
                 <w:szCs w:val="20"/>
               </w:rPr>
               <w:t xml:space="preserve">Production-ready</w:t>
+            </w:r>
+          </w:p>
+        </w:tc>
+      </w:tr>
+      <w:tr>
+        <w:tc>
+          <w:tcPr>
+            <w:tcW w:type="dxa" w:w="4680"/>
+            <w:tcBorders>
+              <w:top w:val="single" w:color="CCCCCC" w:sz="1"/>
+              <w:left w:val="single" w:color="CCCCCC" w:sz="1"/>
+              <w:bottom w:val="single" w:color="CCCCCC" w:sz="1"/>
+              <w:right w:val="single" w:color="CCCCCC" w:sz="1"/>
+            </w:tcBorders>
+            <w:shd w:fill="FFFFFF" w:val="clear"/>
+            <w:tcMar>
+              <w:top w:type="dxa" w:w="80"/>
+              <w:left w:type="dxa" w:w="120"/>
+              <w:bottom w:type="dxa" w:w="80"/>
+              <w:right w:type="dxa" w:w="120"/>
+            </w:tcMar>
+          </w:tcPr>
+          <w:p>
+            <w:r>
+              <w:rPr>
+                <w:rFonts w:ascii="Arial" w:cs="Arial" w:eastAsia="Arial" w:hAnsi="Arial"/>
+                <w:b w:val="false"/>
+                <w:bCs w:val="false"/>
+                <w:color w:val="000000"/>
+                <w:sz w:val="20"/>
+                <w:szCs w:val="20"/>
+              </w:rPr>
+              <w:t xml:space="preserve">Manual ride push — dispatcher selects which bookings enter the queue</w:t>
+            </w:r>
+          </w:p>
+        </w:tc>
+        <w:tc>
+          <w:tcPr>
+            <w:tcW w:type="dxa" w:w="4680"/>
+            <w:tcBorders>
+              <w:top w:val="single" w:color="CCCCCC" w:sz="1"/>
+              <w:left w:val="single" w:color="CCCCCC" w:sz="1"/>
+              <w:bottom w:val="single" w:color="CCCCCC" w:sz="1"/>
+              <w:right w:val="single" w:color="CCCCCC" w:sz="1"/>
+            </w:tcBorders>
+            <w:shd w:fill="FFFFFF" w:val="clear"/>
+            <w:tcMar>
+              <w:top w:type="dxa" w:w="80"/>
+              <w:left w:type="dxa" w:w="120"/>
+              <w:bottom w:type="dxa" w:w="80"/>
+              <w:right w:type="dxa" w:w="120"/>
+            </w:tcMar>
+          </w:tcPr>
+          <w:p>
+            <w:r>
+              <w:rPr>
+                <w:rFonts w:ascii="Arial" w:cs="Arial" w:eastAsia="Arial" w:hAnsi="Arial"/>
+                <w:b w:val="false"/>
+                <w:bCs w:val="false"/>
+                <w:color w:val="000000"/>
+                <w:sz w:val="20"/>
+                <w:szCs w:val="20"/>
+              </w:rPr>
+              <w:t xml:space="preserve">Production-ready (intentional)</w:t>
             </w:r>
           </w:p>
         </w:tc>
@@ -880,7 +882,7 @@
           <w:sz w:val="28"/>
           <w:szCs w:val="28"/>
         </w:rPr>
-        <w:t xml:space="preserve">3. What We Need from Ride Control (3 Items)</w:t>
+        <w:t xml:space="preserve">3. What We Need from Ride Control (2 Items)</w:t>
       </w:r>
     </w:p>
     <w:p>
@@ -896,7 +898,7 @@
           <w:sz w:val="24"/>
           <w:szCs w:val="24"/>
         </w:rPr>
-        <w:t xml:space="preserve">3.1  Inbound Webhook — New Booking Push</w:t>
+        <w:t xml:space="preserve">3.1  Write-back — Assign Driver &amp; Update Notes (Confirmation Required)</w:t>
       </w:r>
     </w:p>
     <w:p>
@@ -909,7 +911,7 @@
           <w:sz w:val="22"/>
           <w:szCs w:val="22"/>
         </w:rPr>
-        <w:t xml:space="preserve">When a booking is created or assigned to our supplier account in Ride Control, send a POST webhook to our server. This replaces the current manual push by the dispatcher.</w:t>
+        <w:t xml:space="preserve">Once a driver accepts a ride through our agent, we immediately call two endpoints on the Ride Control API to update the booking. We have already implemented both calls based on the existing API documentation. We need your team to confirm that these calls are correct and will work with our supplier account.</w:t>
       </w:r>
     </w:p>
     <w:p>
@@ -932,7 +934,7 @@
           <w:sz w:val="22"/>
           <w:szCs w:val="22"/>
         </w:rPr>
-        <w:t xml:space="preserve">Endpoint (our server, you call us):</w:t>
+        <w:t xml:space="preserve">Call 1 — Assign driver to booking:</w:t>
       </w:r>
     </w:p>
     <w:p>
@@ -946,7 +948,7 @@
           <w:sz w:val="18"/>
           <w:szCs w:val="18"/>
         </w:rPr>
-        <w:t xml:space="preserve">POST https://our-server.com/api/webhooks/ride-control</w:t>
+        <w:t xml:space="preserve">POST https://ridecontrolapi.tlv-transfers.com/rest/default/supplier/assigndriver</w:t>
       </w:r>
     </w:p>
     <w:p>
@@ -988,7 +990,7 @@
           <w:sz w:val="18"/>
           <w:szCs w:val="18"/>
         </w:rPr>
-        <w:t xml:space="preserve">  Authorization: Bearer &lt;shared_secret&gt;</w:t>
+        <w:t xml:space="preserve">  Authorization: Bearer &lt;SUPPLIER_API_TOKEN&gt;</w:t>
       </w:r>
     </w:p>
     <w:p>
@@ -1003,6 +1005,90 @@
           <w:szCs w:val="18"/>
         </w:rPr>
         <w:t xml:space="preserve">  Content-Type: application/json</w:t>
+      </w:r>
+    </w:p>
+    <w:p>
+      <w:pPr>
+        <w:shd w:fill="F2F2F2" w:val="clear"/>
+        <w:spacing w:after="0" w:before="0"/>
+      </w:pPr>
+      <w:r>
+        <w:rPr>
+          <w:rFonts w:ascii="Courier New" w:cs="Courier New" w:eastAsia="Courier New" w:hAnsi="Courier New"/>
+          <w:sz w:val="18"/>
+          <w:szCs w:val="18"/>
+        </w:rPr>
+        <w:t xml:space="preserve"/>
+      </w:r>
+    </w:p>
+    <w:p>
+      <w:pPr>
+        <w:shd w:fill="F2F2F2" w:val="clear"/>
+        <w:spacing w:after="0" w:before="0"/>
+      </w:pPr>
+      <w:r>
+        <w:rPr>
+          <w:rFonts w:ascii="Courier New" w:cs="Courier New" w:eastAsia="Courier New" w:hAnsi="Courier New"/>
+          <w:sz w:val="18"/>
+          <w:szCs w:val="18"/>
+        </w:rPr>
+        <w:t xml:space="preserve">Body:</w:t>
+      </w:r>
+    </w:p>
+    <w:p>
+      <w:pPr>
+        <w:shd w:fill="F2F2F2" w:val="clear"/>
+        <w:spacing w:after="0" w:before="0"/>
+      </w:pPr>
+      <w:r>
+        <w:rPr>
+          <w:rFonts w:ascii="Courier New" w:cs="Courier New" w:eastAsia="Courier New" w:hAnsi="Courier New"/>
+          <w:sz w:val="18"/>
+          <w:szCs w:val="18"/>
+        </w:rPr>
+        <w:t xml:space="preserve">{</w:t>
+      </w:r>
+    </w:p>
+    <w:p>
+      <w:pPr>
+        <w:shd w:fill="F2F2F2" w:val="clear"/>
+        <w:spacing w:after="0" w:before="0"/>
+      </w:pPr>
+      <w:r>
+        <w:rPr>
+          <w:rFonts w:ascii="Courier New" w:cs="Courier New" w:eastAsia="Courier New" w:hAnsi="Courier New"/>
+          <w:sz w:val="18"/>
+          <w:szCs w:val="18"/>
+        </w:rPr>
+        <w:t xml:space="preserve">  "bookingid":   20045,</w:t>
+      </w:r>
+    </w:p>
+    <w:p>
+      <w:pPr>
+        <w:shd w:fill="F2F2F2" w:val="clear"/>
+        <w:spacing w:after="0" w:before="0"/>
+      </w:pPr>
+      <w:r>
+        <w:rPr>
+          <w:rFonts w:ascii="Courier New" w:cs="Courier New" w:eastAsia="Courier New" w:hAnsi="Courier New"/>
+          <w:sz w:val="18"/>
+          <w:szCs w:val="18"/>
+        </w:rPr>
+        <w:t xml:space="preserve">  "drivercode":  "D-0042"</w:t>
+      </w:r>
+    </w:p>
+    <w:p>
+      <w:pPr>
+        <w:shd w:fill="F2F2F2" w:val="clear"/>
+        <w:spacing w:after="0" w:before="0"/>
+      </w:pPr>
+      <w:r>
+        <w:rPr>
+          <w:rFonts w:ascii="Courier New" w:cs="Courier New" w:eastAsia="Courier New" w:hAnsi="Courier New"/>
+          <w:sz w:val="18"/>
+          <w:szCs w:val="18"/>
+        </w:rPr>
+        <w:t xml:space="preserve">}</w:t>
       </w:r>
     </w:p>
     <w:p>
@@ -1025,7 +1111,7 @@
           <w:sz w:val="22"/>
           <w:szCs w:val="22"/>
         </w:rPr>
-        <w:t xml:space="preserve">Request body:</w:t>
+        <w:t xml:space="preserve">Call 2 — Write dispatch note to booking:</w:t>
       </w:r>
     </w:p>
     <w:p>
@@ -1039,7 +1125,7 @@
           <w:sz w:val="18"/>
           <w:szCs w:val="18"/>
         </w:rPr>
-        <w:t xml:space="preserve">{</w:t>
+        <w:t xml:space="preserve">POST https://ridecontrolapi.tlv-transfers.com/rest/default/supplier/updatefields</w:t>
       </w:r>
     </w:p>
     <w:p>
@@ -1053,7 +1139,7 @@
           <w:sz w:val="18"/>
           <w:szCs w:val="18"/>
         </w:rPr>
-        <w:t xml:space="preserve">  "booking_id":      "RC-20045",</w:t>
+        <w:t xml:space="preserve"/>
       </w:r>
     </w:p>
     <w:p>
@@ -1067,7 +1153,7 @@
           <w:sz w:val="18"/>
           <w:szCs w:val="18"/>
         </w:rPr>
-        <w:t xml:space="preserve">  "pickup_address":  "Ben Gurion Airport Terminal 3",</w:t>
+        <w:t xml:space="preserve">Headers:</w:t>
       </w:r>
     </w:p>
     <w:p>
@@ -1081,7 +1167,7 @@
           <w:sz w:val="18"/>
           <w:szCs w:val="18"/>
         </w:rPr>
-        <w:t xml:space="preserve">  "dropoff_address": "Dan Hotel, Tel Aviv",</w:t>
+        <w:t xml:space="preserve">  Authorization: Bearer &lt;SUPPLIER_API_TOKEN&gt;</w:t>
       </w:r>
     </w:p>
     <w:p>
@@ -1095,7 +1181,7 @@
           <w:sz w:val="18"/>
           <w:szCs w:val="18"/>
         </w:rPr>
-        <w:t xml:space="preserve">  "pickup_time":     "2026-05-10T08:30:00+03:00",   // ISO 8601</w:t>
+        <w:t xml:space="preserve">  Content-Type: application/json</w:t>
       </w:r>
     </w:p>
     <w:p>
@@ -1109,7 +1195,7 @@
           <w:sz w:val="18"/>
           <w:szCs w:val="18"/>
         </w:rPr>
-        <w:t xml:space="preserve">  "passengers":      4,</w:t>
+        <w:t xml:space="preserve"/>
       </w:r>
     </w:p>
     <w:p>
@@ -1123,7 +1209,7 @@
           <w:sz w:val="18"/>
           <w:szCs w:val="18"/>
         </w:rPr>
-        <w:t xml:space="preserve">  "vehicle_type":    "sedan",                        // sedan|executive_minivan|minivan|minibus_15|minibus_18</w:t>
+        <w:t xml:space="preserve">Body:</w:t>
       </w:r>
     </w:p>
     <w:p>
@@ -1137,7 +1223,7 @@
           <w:sz w:val="18"/>
           <w:szCs w:val="18"/>
         </w:rPr>
-        <w:t xml:space="preserve">  "client_name":     "John Smith",</w:t>
+        <w:t xml:space="preserve">{</w:t>
       </w:r>
     </w:p>
     <w:p>
@@ -1151,7 +1237,7 @@
           <w:sz w:val="18"/>
           <w:szCs w:val="18"/>
         </w:rPr>
-        <w:t xml:space="preserve">  "notes":           "Meet-and-greet sign required"</w:t>
+        <w:t xml:space="preserve">  "bookingid":      20045,</w:t>
       </w:r>
     </w:p>
     <w:p>
@@ -1165,6 +1251,20 @@
           <w:sz w:val="18"/>
           <w:szCs w:val="18"/>
         </w:rPr>
+        <w:t xml:space="preserve">  "suppliernotes":  "Driver: Avi Cohen | 052-6001234 | White Toyota Vito 123-45-678"</w:t>
+      </w:r>
+    </w:p>
+    <w:p>
+      <w:pPr>
+        <w:shd w:fill="F2F2F2" w:val="clear"/>
+        <w:spacing w:after="0" w:before="0"/>
+      </w:pPr>
+      <w:r>
+        <w:rPr>
+          <w:rFonts w:ascii="Courier New" w:cs="Courier New" w:eastAsia="Courier New" w:hAnsi="Courier New"/>
+          <w:sz w:val="18"/>
+          <w:szCs w:val="18"/>
+        </w:rPr>
         <w:t xml:space="preserve">}</w:t>
       </w:r>
     </w:p>
@@ -1183,77 +1283,10 @@
       <w:r>
         <w:rPr>
           <w:rFonts w:ascii="Arial" w:cs="Arial" w:eastAsia="Arial" w:hAnsi="Arial"/>
-          <w:b/>
-          <w:bCs/>
           <w:sz w:val="22"/>
           <w:szCs w:val="22"/>
         </w:rPr>
-        <w:t xml:space="preserve">Response we return:</w:t>
-      </w:r>
-    </w:p>
-    <w:p>
-      <w:pPr>
-        <w:shd w:fill="F2F2F2" w:val="clear"/>
-        <w:spacing w:after="0" w:before="0"/>
-      </w:pPr>
-      <w:r>
-        <w:rPr>
-          <w:rFonts w:ascii="Courier New" w:cs="Courier New" w:eastAsia="Courier New" w:hAnsi="Courier New"/>
-          <w:sz w:val="18"/>
-          <w:szCs w:val="18"/>
-        </w:rPr>
-        <w:t xml:space="preserve">200 OK  { "status": "queued", "trip_id": 1234 }</w:t>
-      </w:r>
-    </w:p>
-    <w:p>
-      <w:pPr>
-        <w:shd w:fill="F2F2F2" w:val="clear"/>
-        <w:spacing w:after="0" w:before="0"/>
-      </w:pPr>
-      <w:r>
-        <w:rPr>
-          <w:rFonts w:ascii="Courier New" w:cs="Courier New" w:eastAsia="Courier New" w:hAnsi="Courier New"/>
-          <w:sz w:val="18"/>
-          <w:szCs w:val="18"/>
-        </w:rPr>
-        <w:t xml:space="preserve">400     { "error": "missing field: booking_id" }</w:t>
-      </w:r>
-    </w:p>
-    <w:p>
-      <w:pPr>
-        <w:spacing w:after="80" w:before="80"/>
-      </w:pPr>
-      <w:r>
-        <w:t xml:space="preserve"/>
-      </w:r>
-    </w:p>
-    <w:p>
-      <w:pPr>
-        <w:pStyle w:val="Heading2"/>
-        <w:spacing w:after="80" w:before="240"/>
-      </w:pPr>
-      <w:r>
-        <w:rPr>
-          <w:rFonts w:ascii="Arial" w:cs="Arial" w:eastAsia="Arial" w:hAnsi="Arial"/>
-          <w:b/>
-          <w:bCs/>
-          <w:sz w:val="24"/>
-          <w:szCs w:val="24"/>
-        </w:rPr>
-        <w:t xml:space="preserve">3.2  Outbound Write-back — Assign Driver &amp; Update Notes</w:t>
-      </w:r>
-    </w:p>
-    <w:p>
-      <w:pPr>
-        <w:spacing w:after="80" w:before="80"/>
-      </w:pPr>
-      <w:r>
-        <w:rPr>
-          <w:rFonts w:ascii="Arial" w:cs="Arial" w:eastAsia="Arial" w:hAnsi="Arial"/>
-          <w:sz w:val="22"/>
-          <w:szCs w:val="22"/>
-        </w:rPr>
-        <w:t xml:space="preserve">After the agent selects a driver, it needs to write two things back to Ride Control:</w:t>
+        <w:t xml:space="preserve">Questions for your team:</w:t>
       </w:r>
     </w:p>
     <w:p>
@@ -1271,7 +1304,7 @@
           <w:sz w:val="22"/>
           <w:szCs w:val="22"/>
         </w:rPr>
-        <w:t xml:space="preserve">Set the assigned driver on the booking.</w:t>
+        <w:t xml:space="preserve">Please confirm the endpoint paths above are correct for our supplier account.</w:t>
       </w:r>
     </w:p>
     <w:p>
@@ -1289,178 +1322,7 @@
           <w:sz w:val="22"/>
           <w:szCs w:val="22"/>
         </w:rPr>
-        <w:t xml:space="preserve">Append a note with driver details (name, phone, vehicle plate).</w:t>
-      </w:r>
-    </w:p>
-    <w:p>
-      <w:pPr>
-        <w:spacing w:after="80" w:before="80"/>
-      </w:pPr>
-      <w:r>
-        <w:t xml:space="preserve"/>
-      </w:r>
-    </w:p>
-    <w:p>
-      <w:pPr>
-        <w:spacing w:after="80" w:before="80"/>
-      </w:pPr>
-      <w:r>
-        <w:rPr>
-          <w:rFonts w:ascii="Arial" w:cs="Arial" w:eastAsia="Arial" w:hAnsi="Arial"/>
-          <w:b/>
-          <w:bCs/>
-          <w:sz w:val="22"/>
-          <w:szCs w:val="22"/>
-        </w:rPr>
-        <w:t xml:space="preserve">We call your existing API (already documented at ridecontrolapi.tlv-transfers.com):</w:t>
-      </w:r>
-    </w:p>
-    <w:p>
-      <w:pPr>
-        <w:shd w:fill="F2F2F2" w:val="clear"/>
-        <w:spacing w:after="0" w:before="0"/>
-      </w:pPr>
-      <w:r>
-        <w:rPr>
-          <w:rFonts w:ascii="Courier New" w:cs="Courier New" w:eastAsia="Courier New" w:hAnsi="Courier New"/>
-          <w:sz w:val="18"/>
-          <w:szCs w:val="18"/>
-        </w:rPr>
-        <w:t xml:space="preserve">// Assign driver</w:t>
-      </w:r>
-    </w:p>
-    <w:p>
-      <w:pPr>
-        <w:shd w:fill="F2F2F2" w:val="clear"/>
-        <w:spacing w:after="0" w:before="0"/>
-      </w:pPr>
-      <w:r>
-        <w:rPr>
-          <w:rFonts w:ascii="Courier New" w:cs="Courier New" w:eastAsia="Courier New" w:hAnsi="Courier New"/>
-          <w:sz w:val="18"/>
-          <w:szCs w:val="18"/>
-        </w:rPr>
-        <w:t xml:space="preserve">PUT /rest/default/supplier/bookings/{booking_id}/driver</w:t>
-      </w:r>
-    </w:p>
-    <w:p>
-      <w:pPr>
-        <w:shd w:fill="F2F2F2" w:val="clear"/>
-        <w:spacing w:after="0" w:before="0"/>
-      </w:pPr>
-      <w:r>
-        <w:rPr>
-          <w:rFonts w:ascii="Courier New" w:cs="Courier New" w:eastAsia="Courier New" w:hAnsi="Courier New"/>
-          <w:sz w:val="18"/>
-          <w:szCs w:val="18"/>
-        </w:rPr>
-        <w:t xml:space="preserve">Body: { "driver_id": "D-0042" }</w:t>
-      </w:r>
-    </w:p>
-    <w:p>
-      <w:pPr>
-        <w:shd w:fill="F2F2F2" w:val="clear"/>
-        <w:spacing w:after="0" w:before="0"/>
-      </w:pPr>
-      <w:r>
-        <w:rPr>
-          <w:rFonts w:ascii="Courier New" w:cs="Courier New" w:eastAsia="Courier New" w:hAnsi="Courier New"/>
-          <w:sz w:val="18"/>
-          <w:szCs w:val="18"/>
-        </w:rPr>
-        <w:t xml:space="preserve"/>
-      </w:r>
-    </w:p>
-    <w:p>
-      <w:pPr>
-        <w:shd w:fill="F2F2F2" w:val="clear"/>
-        <w:spacing w:after="0" w:before="0"/>
-      </w:pPr>
-      <w:r>
-        <w:rPr>
-          <w:rFonts w:ascii="Courier New" w:cs="Courier New" w:eastAsia="Courier New" w:hAnsi="Courier New"/>
-          <w:sz w:val="18"/>
-          <w:szCs w:val="18"/>
-        </w:rPr>
-        <w:t xml:space="preserve">// Add note</w:t>
-      </w:r>
-    </w:p>
-    <w:p>
-      <w:pPr>
-        <w:shd w:fill="F2F2F2" w:val="clear"/>
-        <w:spacing w:after="0" w:before="0"/>
-      </w:pPr>
-      <w:r>
-        <w:rPr>
-          <w:rFonts w:ascii="Courier New" w:cs="Courier New" w:eastAsia="Courier New" w:hAnsi="Courier New"/>
-          <w:sz w:val="18"/>
-          <w:szCs w:val="18"/>
-        </w:rPr>
-        <w:t xml:space="preserve">POST /rest/default/supplier/bookings/{booking_id}/notes</w:t>
-      </w:r>
-    </w:p>
-    <w:p>
-      <w:pPr>
-        <w:shd w:fill="F2F2F2" w:val="clear"/>
-        <w:spacing w:after="0" w:before="0"/>
-      </w:pPr>
-      <w:r>
-        <w:rPr>
-          <w:rFonts w:ascii="Courier New" w:cs="Courier New" w:eastAsia="Courier New" w:hAnsi="Courier New"/>
-          <w:sz w:val="18"/>
-          <w:szCs w:val="18"/>
-        </w:rPr>
-        <w:t xml:space="preserve">Body: { "text": "Driver: Avi Cohen | 052-6001234 | White Toyota Vito 123-45-678" }</w:t>
-      </w:r>
-    </w:p>
-    <w:p>
-      <w:pPr>
-        <w:spacing w:after="80" w:before="80"/>
-      </w:pPr>
-      <w:r>
-        <w:rPr>
-          <w:rFonts w:ascii="Arial" w:cs="Arial" w:eastAsia="Arial" w:hAnsi="Arial"/>
-          <w:sz w:val="22"/>
-          <w:szCs w:val="22"/>
-        </w:rPr>
-        <w:t xml:space="preserve">Question for your team: Please confirm the exact endpoint paths and whether driver_id maps to your internal driver table or to a phone number. We can adapt.</w:t>
-      </w:r>
-    </w:p>
-    <w:p>
-      <w:pPr>
-        <w:spacing w:after="80" w:before="80"/>
-      </w:pPr>
-      <w:r>
-        <w:t xml:space="preserve"/>
-      </w:r>
-    </w:p>
-    <w:p>
-      <w:pPr>
-        <w:pStyle w:val="Heading2"/>
-        <w:spacing w:after="80" w:before="240"/>
-      </w:pPr>
-      <w:r>
-        <w:rPr>
-          <w:rFonts w:ascii="Arial" w:cs="Arial" w:eastAsia="Arial" w:hAnsi="Arial"/>
-          <w:b/>
-          <w:bCs/>
-          <w:sz w:val="24"/>
-          <w:szCs w:val="24"/>
-        </w:rPr>
-        <w:t xml:space="preserve">3.3  Driver Approval Link — Confirmation Callback</w:t>
-      </w:r>
-    </w:p>
-    <w:p>
-      <w:pPr>
-        <w:spacing w:after="80" w:before="80"/>
-      </w:pPr>
-      <w:r>
-        <w:rPr>
-          <w:rFonts w:ascii="Arial" w:cs="Arial" w:eastAsia="Arial" w:hAnsi="Arial"/>
-          <w:sz w:val="22"/>
-          <w:szCs w:val="22"/>
-        </w:rPr>
-        <w:t xml:space="preserve">Our flow requires official confirmation from the driver via a Ride Control link. The sequence is:</w:t>
+        <w:t xml:space="preserve">What format does drivercode use — internal employee ID, phone number, or something else?</w:t>
       </w:r>
     </w:p>
     <w:p>
@@ -1478,7 +1340,44 @@
           <w:sz w:val="22"/>
           <w:szCs w:val="22"/>
         </w:rPr>
-        <w:t xml:space="preserve">Agent sends driver a WhatsApp: "Reply YES to accept, then confirm via link: &lt;RC link&gt;"</w:t>
+        <w:t xml:space="preserve">Should we call /assigndriver before or after the driver clicks the approval link (see 3.2)?</w:t>
+      </w:r>
+    </w:p>
+    <w:p>
+      <w:pPr>
+        <w:spacing w:after="80" w:before="80"/>
+      </w:pPr>
+      <w:r>
+        <w:t xml:space="preserve"/>
+      </w:r>
+    </w:p>
+    <w:p>
+      <w:pPr>
+        <w:pStyle w:val="Heading2"/>
+        <w:spacing w:after="80" w:before="240"/>
+      </w:pPr>
+      <w:r>
+        <w:rPr>
+          <w:rFonts w:ascii="Arial" w:cs="Arial" w:eastAsia="Arial" w:hAnsi="Arial"/>
+          <w:b/>
+          <w:bCs/>
+          <w:sz w:val="24"/>
+          <w:szCs w:val="24"/>
+        </w:rPr>
+        <w:t xml:space="preserve">3.2  Driver Approval Link — New Callback Required</w:t>
+      </w:r>
+    </w:p>
+    <w:p>
+      <w:pPr>
+        <w:spacing w:after="80" w:before="80"/>
+      </w:pPr>
+      <w:r>
+        <w:rPr>
+          <w:rFonts w:ascii="Arial" w:cs="Arial" w:eastAsia="Arial" w:hAnsi="Arial"/>
+          <w:sz w:val="22"/>
+          <w:szCs w:val="22"/>
+        </w:rPr>
+        <w:t xml:space="preserve">Our dispatch flow has two confirmation steps on purpose:</w:t>
       </w:r>
     </w:p>
     <w:p>
@@ -1496,7 +1395,7 @@
           <w:sz w:val="22"/>
           <w:szCs w:val="22"/>
         </w:rPr>
-        <w:t xml:space="preserve">Driver clicks the link and approves in Ride Control.</w:t>
+        <w:t xml:space="preserve">Step 1: The driver replies YES on WhatsApp. This is treated as intent, not a binding commitment.</w:t>
       </w:r>
     </w:p>
     <w:p>
@@ -1514,7 +1413,28 @@
           <w:sz w:val="22"/>
           <w:szCs w:val="22"/>
         </w:rPr>
-        <w:t xml:space="preserve">Ride Control calls our callback to finalize the booking.</w:t>
+        <w:t xml:space="preserve">Step 2: The driver clicks a Ride Control link and confirms inside the platform. This is the official acceptance.</w:t>
+      </w:r>
+    </w:p>
+    <w:p>
+      <w:pPr>
+        <w:spacing w:after="80" w:before="80"/>
+      </w:pPr>
+      <w:r>
+        <w:t xml:space="preserve"/>
+      </w:r>
+    </w:p>
+    <w:p>
+      <w:pPr>
+        <w:spacing w:after="80" w:before="80"/>
+      </w:pPr>
+      <w:r>
+        <w:rPr>
+          <w:rFonts w:ascii="Arial" w:cs="Arial" w:eastAsia="Arial" w:hAnsi="Arial"/>
+          <w:sz w:val="22"/>
+          <w:szCs w:val="22"/>
+        </w:rPr>
+        <w:t xml:space="preserve">Why both steps? We have found that drivers sometimes reply positively on WhatsApp but then become unavailable. By requiring a second confirmation inside Ride Control, the booking is only locked in when the driver actively approves it in the operating system. If the driver replies YES on WhatsApp but does not click the link within 1 hour, our agent automatically suspends the booking and alerts the dispatcher.</w:t>
       </w:r>
     </w:p>
     <w:p>
@@ -1538,6 +1458,316 @@
           <w:szCs w:val="22"/>
         </w:rPr>
         <w:t xml:space="preserve">What we need from you:</w:t>
+      </w:r>
+    </w:p>
+    <w:p>
+      <w:pPr>
+        <w:spacing w:after="80" w:before="80"/>
+      </w:pPr>
+      <w:r>
+        <w:t xml:space="preserve"/>
+      </w:r>
+    </w:p>
+    <w:p>
+      <w:pPr>
+        <w:spacing w:after="80" w:before="80"/>
+      </w:pPr>
+      <w:r>
+        <w:rPr>
+          <w:rFonts w:ascii="Arial" w:cs="Arial" w:eastAsia="Arial" w:hAnsi="Arial"/>
+          <w:b/>
+          <w:bCs/>
+          <w:sz w:val="22"/>
+          <w:szCs w:val="22"/>
+        </w:rPr>
+        <w:t xml:space="preserve">Part A — Approval page URL</w:t>
+      </w:r>
+    </w:p>
+    <w:p>
+      <w:pPr>
+        <w:spacing w:after="80" w:before="80"/>
+      </w:pPr>
+      <w:r>
+        <w:rPr>
+          <w:rFonts w:ascii="Arial" w:cs="Arial" w:eastAsia="Arial" w:hAnsi="Arial"/>
+          <w:sz w:val="22"/>
+          <w:szCs w:val="22"/>
+        </w:rPr>
+        <w:t xml:space="preserve">We need a URL to send the driver that opens a confirmation page inside Ride Control. We will embed this link in every driver WhatsApp message. Example format:</w:t>
+      </w:r>
+    </w:p>
+    <w:p>
+      <w:pPr>
+        <w:shd w:fill="F2F2F2" w:val="clear"/>
+        <w:spacing w:after="0" w:before="0"/>
+      </w:pPr>
+      <w:r>
+        <w:rPr>
+          <w:rFonts w:ascii="Courier New" w:cs="Courier New" w:eastAsia="Courier New" w:hAnsi="Courier New"/>
+          <w:sz w:val="18"/>
+          <w:szCs w:val="18"/>
+        </w:rPr>
+        <w:t xml:space="preserve">https://ridecontrol.tlv-transfers.com/booking/{booking_id}/approve?token={token}</w:t>
+      </w:r>
+    </w:p>
+    <w:p>
+      <w:pPr>
+        <w:spacing w:after="80" w:before="80"/>
+      </w:pPr>
+      <w:r>
+        <w:rPr>
+          <w:rFonts w:ascii="Arial" w:cs="Arial" w:eastAsia="Arial" w:hAnsi="Arial"/>
+          <w:sz w:val="22"/>
+          <w:szCs w:val="22"/>
+        </w:rPr>
+        <w:t xml:space="preserve">Please confirm the actual URL format, and whether a token or signed parameter is required for security.</w:t>
+      </w:r>
+    </w:p>
+    <w:p>
+      <w:pPr>
+        <w:spacing w:after="80" w:before="80"/>
+      </w:pPr>
+      <w:r>
+        <w:t xml:space="preserve"/>
+      </w:r>
+    </w:p>
+    <w:p>
+      <w:pPr>
+        <w:spacing w:after="80" w:before="80"/>
+      </w:pPr>
+      <w:r>
+        <w:rPr>
+          <w:rFonts w:ascii="Arial" w:cs="Arial" w:eastAsia="Arial" w:hAnsi="Arial"/>
+          <w:b/>
+          <w:bCs/>
+          <w:sz w:val="22"/>
+          <w:szCs w:val="22"/>
+        </w:rPr>
+        <w:t xml:space="preserve">Part B — Approval callback to our server</w:t>
+      </w:r>
+    </w:p>
+    <w:p>
+      <w:pPr>
+        <w:spacing w:after="80" w:before="80"/>
+      </w:pPr>
+      <w:r>
+        <w:rPr>
+          <w:rFonts w:ascii="Arial" w:cs="Arial" w:eastAsia="Arial" w:hAnsi="Arial"/>
+          <w:sz w:val="22"/>
+          <w:szCs w:val="22"/>
+        </w:rPr>
+        <w:t xml:space="preserve">When the driver clicks Approve or Decline on that page, Ride Control should POST a notification to our server so we can update the booking state immediately.</w:t>
+      </w:r>
+    </w:p>
+    <w:p>
+      <w:pPr>
+        <w:spacing w:after="80" w:before="80"/>
+      </w:pPr>
+      <w:r>
+        <w:t xml:space="preserve"/>
+      </w:r>
+    </w:p>
+    <w:p>
+      <w:pPr>
+        <w:shd w:fill="F2F2F2" w:val="clear"/>
+        <w:spacing w:after="0" w:before="0"/>
+      </w:pPr>
+      <w:r>
+        <w:rPr>
+          <w:rFonts w:ascii="Courier New" w:cs="Courier New" w:eastAsia="Courier New" w:hAnsi="Courier New"/>
+          <w:sz w:val="18"/>
+          <w:szCs w:val="18"/>
+        </w:rPr>
+        <w:t xml:space="preserve">POST https://our-server.com/api/trips/{booking_id}/rc-status</w:t>
+      </w:r>
+    </w:p>
+    <w:p>
+      <w:pPr>
+        <w:shd w:fill="F2F2F2" w:val="clear"/>
+        <w:spacing w:after="0" w:before="0"/>
+      </w:pPr>
+      <w:r>
+        <w:rPr>
+          <w:rFonts w:ascii="Courier New" w:cs="Courier New" w:eastAsia="Courier New" w:hAnsi="Courier New"/>
+          <w:sz w:val="18"/>
+          <w:szCs w:val="18"/>
+        </w:rPr>
+        <w:t xml:space="preserve"/>
+      </w:r>
+    </w:p>
+    <w:p>
+      <w:pPr>
+        <w:shd w:fill="F2F2F2" w:val="clear"/>
+        <w:spacing w:after="0" w:before="0"/>
+      </w:pPr>
+      <w:r>
+        <w:rPr>
+          <w:rFonts w:ascii="Courier New" w:cs="Courier New" w:eastAsia="Courier New" w:hAnsi="Courier New"/>
+          <w:sz w:val="18"/>
+          <w:szCs w:val="18"/>
+        </w:rPr>
+        <w:t xml:space="preserve">Headers:</w:t>
+      </w:r>
+    </w:p>
+    <w:p>
+      <w:pPr>
+        <w:shd w:fill="F2F2F2" w:val="clear"/>
+        <w:spacing w:after="0" w:before="0"/>
+      </w:pPr>
+      <w:r>
+        <w:rPr>
+          <w:rFonts w:ascii="Courier New" w:cs="Courier New" w:eastAsia="Courier New" w:hAnsi="Courier New"/>
+          <w:sz w:val="18"/>
+          <w:szCs w:val="18"/>
+        </w:rPr>
+        <w:t xml:space="preserve">  Authorization: Bearer &lt;shared_secret&gt;</w:t>
+      </w:r>
+    </w:p>
+    <w:p>
+      <w:pPr>
+        <w:shd w:fill="F2F2F2" w:val="clear"/>
+        <w:spacing w:after="0" w:before="0"/>
+      </w:pPr>
+      <w:r>
+        <w:rPr>
+          <w:rFonts w:ascii="Courier New" w:cs="Courier New" w:eastAsia="Courier New" w:hAnsi="Courier New"/>
+          <w:sz w:val="18"/>
+          <w:szCs w:val="18"/>
+        </w:rPr>
+        <w:t xml:space="preserve">  Content-Type: application/json</w:t>
+      </w:r>
+    </w:p>
+    <w:p>
+      <w:pPr>
+        <w:shd w:fill="F2F2F2" w:val="clear"/>
+        <w:spacing w:after="0" w:before="0"/>
+      </w:pPr>
+      <w:r>
+        <w:rPr>
+          <w:rFonts w:ascii="Courier New" w:cs="Courier New" w:eastAsia="Courier New" w:hAnsi="Courier New"/>
+          <w:sz w:val="18"/>
+          <w:szCs w:val="18"/>
+        </w:rPr>
+        <w:t xml:space="preserve"/>
+      </w:r>
+    </w:p>
+    <w:p>
+      <w:pPr>
+        <w:shd w:fill="F2F2F2" w:val="clear"/>
+        <w:spacing w:after="0" w:before="0"/>
+      </w:pPr>
+      <w:r>
+        <w:rPr>
+          <w:rFonts w:ascii="Courier New" w:cs="Courier New" w:eastAsia="Courier New" w:hAnsi="Courier New"/>
+          <w:sz w:val="18"/>
+          <w:szCs w:val="18"/>
+        </w:rPr>
+        <w:t xml:space="preserve">Body:</w:t>
+      </w:r>
+    </w:p>
+    <w:p>
+      <w:pPr>
+        <w:shd w:fill="F2F2F2" w:val="clear"/>
+        <w:spacing w:after="0" w:before="0"/>
+      </w:pPr>
+      <w:r>
+        <w:rPr>
+          <w:rFonts w:ascii="Courier New" w:cs="Courier New" w:eastAsia="Courier New" w:hAnsi="Courier New"/>
+          <w:sz w:val="18"/>
+          <w:szCs w:val="18"/>
+        </w:rPr>
+        <w:t xml:space="preserve">{</w:t>
+      </w:r>
+    </w:p>
+    <w:p>
+      <w:pPr>
+        <w:shd w:fill="F2F2F2" w:val="clear"/>
+        <w:spacing w:after="0" w:before="0"/>
+      </w:pPr>
+      <w:r>
+        <w:rPr>
+          <w:rFonts w:ascii="Courier New" w:cs="Courier New" w:eastAsia="Courier New" w:hAnsi="Courier New"/>
+          <w:sz w:val="18"/>
+          <w:szCs w:val="18"/>
+        </w:rPr>
+        <w:t xml:space="preserve">  "booking_id":  "RC-20045",</w:t>
+      </w:r>
+    </w:p>
+    <w:p>
+      <w:pPr>
+        <w:shd w:fill="F2F2F2" w:val="clear"/>
+        <w:spacing w:after="0" w:before="0"/>
+      </w:pPr>
+      <w:r>
+        <w:rPr>
+          <w:rFonts w:ascii="Courier New" w:cs="Courier New" w:eastAsia="Courier New" w:hAnsi="Courier New"/>
+          <w:sz w:val="18"/>
+          <w:szCs w:val="18"/>
+        </w:rPr>
+        <w:t xml:space="preserve">  "status":      "approved" | "declined",</w:t>
+      </w:r>
+    </w:p>
+    <w:p>
+      <w:pPr>
+        <w:shd w:fill="F2F2F2" w:val="clear"/>
+        <w:spacing w:after="0" w:before="0"/>
+      </w:pPr>
+      <w:r>
+        <w:rPr>
+          <w:rFonts w:ascii="Courier New" w:cs="Courier New" w:eastAsia="Courier New" w:hAnsi="Courier New"/>
+          <w:sz w:val="18"/>
+          <w:szCs w:val="18"/>
+        </w:rPr>
+        <w:t xml:space="preserve">  "driver_id":   "D-0042",</w:t>
+      </w:r>
+    </w:p>
+    <w:p>
+      <w:pPr>
+        <w:shd w:fill="F2F2F2" w:val="clear"/>
+        <w:spacing w:after="0" w:before="0"/>
+      </w:pPr>
+      <w:r>
+        <w:rPr>
+          <w:rFonts w:ascii="Courier New" w:cs="Courier New" w:eastAsia="Courier New" w:hAnsi="Courier New"/>
+          <w:sz w:val="18"/>
+          <w:szCs w:val="18"/>
+        </w:rPr>
+        <w:t xml:space="preserve">  "timestamp":   "2026-05-10T09:15:00+03:00"</w:t>
+      </w:r>
+    </w:p>
+    <w:p>
+      <w:pPr>
+        <w:shd w:fill="F2F2F2" w:val="clear"/>
+        <w:spacing w:after="0" w:before="0"/>
+      </w:pPr>
+      <w:r>
+        <w:rPr>
+          <w:rFonts w:ascii="Courier New" w:cs="Courier New" w:eastAsia="Courier New" w:hAnsi="Courier New"/>
+          <w:sz w:val="18"/>
+          <w:szCs w:val="18"/>
+        </w:rPr>
+        <w:t xml:space="preserve">}</w:t>
+      </w:r>
+    </w:p>
+    <w:p>
+      <w:pPr>
+        <w:spacing w:after="80" w:before="80"/>
+      </w:pPr>
+      <w:r>
+        <w:t xml:space="preserve"/>
+      </w:r>
+    </w:p>
+    <w:p>
+      <w:pPr>
+        <w:spacing w:after="80" w:before="80"/>
+      </w:pPr>
+      <w:r>
+        <w:rPr>
+          <w:rFonts w:ascii="Arial" w:cs="Arial" w:eastAsia="Arial" w:hAnsi="Arial"/>
+          <w:sz w:val="22"/>
+          <w:szCs w:val="22"/>
+        </w:rPr>
+        <w:t xml:space="preserve">What happens on our side when we receive this callback:</w:t>
       </w:r>
     </w:p>
     <w:p>
@@ -1555,7 +1785,7 @@
           <w:sz w:val="22"/>
           <w:szCs w:val="22"/>
         </w:rPr>
-        <w:t xml:space="preserve">A URL format for the driver approval page: e.g. https://ridecontrol.tlv-transfers.com/booking/{booking_id}/approve?token={token}</w:t>
+        <w:t xml:space="preserve">approved  →  booking confirmed, driver assigned in our system, Ride Control write-back triggered (3.1).</w:t>
       </w:r>
     </w:p>
     <w:p>
@@ -1573,200 +1803,7 @@
           <w:sz w:val="22"/>
           <w:szCs w:val="22"/>
         </w:rPr>
-        <w:t xml:space="preserve">A POST callback to our endpoint when the driver clicks Approve or Decline.</w:t>
-      </w:r>
-    </w:p>
-    <w:p>
-      <w:pPr>
-        <w:spacing w:after="80" w:before="80"/>
-      </w:pPr>
-      <w:r>
-        <w:t xml:space="preserve"/>
-      </w:r>
-    </w:p>
-    <w:p>
-      <w:pPr>
-        <w:spacing w:after="80" w:before="80"/>
-      </w:pPr>
-      <w:r>
-        <w:rPr>
-          <w:rFonts w:ascii="Arial" w:cs="Arial" w:eastAsia="Arial" w:hAnsi="Arial"/>
-          <w:b/>
-          <w:bCs/>
-          <w:sz w:val="22"/>
-          <w:szCs w:val="22"/>
-        </w:rPr>
-        <w:t xml:space="preserve">Callback to our server:</w:t>
-      </w:r>
-    </w:p>
-    <w:p>
-      <w:pPr>
-        <w:shd w:fill="F2F2F2" w:val="clear"/>
-        <w:spacing w:after="0" w:before="0"/>
-      </w:pPr>
-      <w:r>
-        <w:rPr>
-          <w:rFonts w:ascii="Courier New" w:cs="Courier New" w:eastAsia="Courier New" w:hAnsi="Courier New"/>
-          <w:sz w:val="18"/>
-          <w:szCs w:val="18"/>
-        </w:rPr>
-        <w:t xml:space="preserve">POST https://our-server.com/api/trips/{booking_id}/rc-status</w:t>
-      </w:r>
-    </w:p>
-    <w:p>
-      <w:pPr>
-        <w:shd w:fill="F2F2F2" w:val="clear"/>
-        <w:spacing w:after="0" w:before="0"/>
-      </w:pPr>
-      <w:r>
-        <w:rPr>
-          <w:rFonts w:ascii="Courier New" w:cs="Courier New" w:eastAsia="Courier New" w:hAnsi="Courier New"/>
-          <w:sz w:val="18"/>
-          <w:szCs w:val="18"/>
-        </w:rPr>
-        <w:t xml:space="preserve"/>
-      </w:r>
-    </w:p>
-    <w:p>
-      <w:pPr>
-        <w:shd w:fill="F2F2F2" w:val="clear"/>
-        <w:spacing w:after="0" w:before="0"/>
-      </w:pPr>
-      <w:r>
-        <w:rPr>
-          <w:rFonts w:ascii="Courier New" w:cs="Courier New" w:eastAsia="Courier New" w:hAnsi="Courier New"/>
-          <w:sz w:val="18"/>
-          <w:szCs w:val="18"/>
-        </w:rPr>
-        <w:t xml:space="preserve">{</w:t>
-      </w:r>
-    </w:p>
-    <w:p>
-      <w:pPr>
-        <w:shd w:fill="F2F2F2" w:val="clear"/>
-        <w:spacing w:after="0" w:before="0"/>
-      </w:pPr>
-      <w:r>
-        <w:rPr>
-          <w:rFonts w:ascii="Courier New" w:cs="Courier New" w:eastAsia="Courier New" w:hAnsi="Courier New"/>
-          <w:sz w:val="18"/>
-          <w:szCs w:val="18"/>
-        </w:rPr>
-        <w:t xml:space="preserve">  "booking_id": "RC-20045",</w:t>
-      </w:r>
-    </w:p>
-    <w:p>
-      <w:pPr>
-        <w:shd w:fill="F2F2F2" w:val="clear"/>
-        <w:spacing w:after="0" w:before="0"/>
-      </w:pPr>
-      <w:r>
-        <w:rPr>
-          <w:rFonts w:ascii="Courier New" w:cs="Courier New" w:eastAsia="Courier New" w:hAnsi="Courier New"/>
-          <w:sz w:val="18"/>
-          <w:szCs w:val="18"/>
-        </w:rPr>
-        <w:t xml:space="preserve">  "status":     "approved" | "declined",</w:t>
-      </w:r>
-    </w:p>
-    <w:p>
-      <w:pPr>
-        <w:shd w:fill="F2F2F2" w:val="clear"/>
-        <w:spacing w:after="0" w:before="0"/>
-      </w:pPr>
-      <w:r>
-        <w:rPr>
-          <w:rFonts w:ascii="Courier New" w:cs="Courier New" w:eastAsia="Courier New" w:hAnsi="Courier New"/>
-          <w:sz w:val="18"/>
-          <w:szCs w:val="18"/>
-        </w:rPr>
-        <w:t xml:space="preserve">  "driver_id":  "D-0042",</w:t>
-      </w:r>
-    </w:p>
-    <w:p>
-      <w:pPr>
-        <w:shd w:fill="F2F2F2" w:val="clear"/>
-        <w:spacing w:after="0" w:before="0"/>
-      </w:pPr>
-      <w:r>
-        <w:rPr>
-          <w:rFonts w:ascii="Courier New" w:cs="Courier New" w:eastAsia="Courier New" w:hAnsi="Courier New"/>
-          <w:sz w:val="18"/>
-          <w:szCs w:val="18"/>
-        </w:rPr>
-        <w:t xml:space="preserve">  "timestamp":  "2026-05-10T09:15:00+03:00"</w:t>
-      </w:r>
-    </w:p>
-    <w:p>
-      <w:pPr>
-        <w:shd w:fill="F2F2F2" w:val="clear"/>
-        <w:spacing w:after="0" w:before="0"/>
-      </w:pPr>
-      <w:r>
-        <w:rPr>
-          <w:rFonts w:ascii="Courier New" w:cs="Courier New" w:eastAsia="Courier New" w:hAnsi="Courier New"/>
-          <w:sz w:val="18"/>
-          <w:szCs w:val="18"/>
-        </w:rPr>
-        <w:t xml:space="preserve">}</w:t>
-      </w:r>
-    </w:p>
-    <w:p>
-      <w:pPr>
-        <w:spacing w:after="80" w:before="80"/>
-      </w:pPr>
-      <w:r>
-        <w:t xml:space="preserve"/>
-      </w:r>
-    </w:p>
-    <w:p>
-      <w:pPr>
-        <w:spacing w:after="80" w:before="80"/>
-      </w:pPr>
-      <w:r>
-        <w:rPr>
-          <w:rFonts w:ascii="Arial" w:cs="Arial" w:eastAsia="Arial" w:hAnsi="Arial"/>
-          <w:sz w:val="22"/>
-          <w:szCs w:val="22"/>
-        </w:rPr>
-        <w:t xml:space="preserve">If the driver approves on WhatsApp but does NOT click the link within 1 hour, we automatically suspend the booking and alert our dispatcher (Michel). The link confirmation is the authoritative acceptance — WhatsApp reply alone is not sufficient.</w:t>
-      </w:r>
-    </w:p>
-    <w:p>
-      <w:pPr>
-        <w:spacing w:after="80" w:before="80"/>
-      </w:pPr>
-      <w:r>
-        <w:t xml:space="preserve"/>
-      </w:r>
-    </w:p>
-    <w:p>
-      <w:pPr>
-        <w:pStyle w:val="Heading1"/>
-        <w:spacing w:after="120" w:before="360"/>
-      </w:pPr>
-      <w:r>
-        <w:rPr>
-          <w:rFonts w:ascii="Arial" w:cs="Arial" w:eastAsia="Arial" w:hAnsi="Arial"/>
-          <w:b/>
-          <w:bCs/>
-          <w:sz w:val="28"/>
-          <w:szCs w:val="28"/>
-        </w:rPr>
-        <w:t xml:space="preserve">4. Authentication</w:t>
-      </w:r>
-    </w:p>
-    <w:p>
-      <w:pPr>
-        <w:spacing w:after="80" w:before="80"/>
-      </w:pPr>
-      <w:r>
-        <w:rPr>
-          <w:rFonts w:ascii="Arial" w:cs="Arial" w:eastAsia="Arial" w:hAnsi="Arial"/>
-          <w:sz w:val="22"/>
-          <w:szCs w:val="22"/>
-        </w:rPr>
-        <w:t xml:space="preserve">We suggest a simple shared-secret scheme for the webhook calls between our systems:</w:t>
+        <w:t xml:space="preserve">declined  →  booking re-queued to the next best available driver automatically.</w:t>
       </w:r>
     </w:p>
     <w:p>
@@ -1784,45 +1821,242 @@
           <w:sz w:val="22"/>
           <w:szCs w:val="22"/>
         </w:rPr>
-        <w:t xml:space="preserve">Ride Control → our server: Bearer token in Authorization header (we generate and share a secret).</w:t>
-      </w:r>
-    </w:p>
-    <w:p>
-      <w:pPr>
-        <w:pStyle w:val="ListParagraph"/>
-        <w:numPr>
-          <w:ilvl w:val="0"/>
-          <w:numId w:val="1"/>
-        </w:numPr>
-        <w:spacing w:after="40" w:before="40"/>
-      </w:pPr>
-      <w:r>
-        <w:rPr>
-          <w:rFonts w:ascii="Arial" w:cs="Arial" w:eastAsia="Arial" w:hAnsi="Arial"/>
-          <w:sz w:val="22"/>
-          <w:szCs w:val="22"/>
-        </w:rPr>
-        <w:t xml:space="preserve">Our server → Ride Control: Existing supplier API token (already in our config).</w:t>
-      </w:r>
-    </w:p>
-    <w:p>
-      <w:pPr>
-        <w:pStyle w:val="ListParagraph"/>
-        <w:numPr>
-          <w:ilvl w:val="0"/>
-          <w:numId w:val="1"/>
-        </w:numPr>
-        <w:spacing w:after="40" w:before="40"/>
-      </w:pPr>
-      <w:r>
-        <w:rPr>
-          <w:rFonts w:ascii="Arial" w:cs="Arial" w:eastAsia="Arial" w:hAnsi="Arial"/>
-          <w:sz w:val="22"/>
-          <w:szCs w:val="22"/>
-        </w:rPr>
-        <w:t xml:space="preserve">Driver approval callback: same Bearer token, or a short-lived HMAC-signed URL — whichever you prefer.</w:t>
-      </w:r>
-    </w:p>
+        <w:t xml:space="preserve">No callback within 1 hour of driver WhatsApp YES  →  booking suspended, dispatcher (Michel) alerted.</w:t>
+      </w:r>
+    </w:p>
+    <w:p>
+      <w:pPr>
+        <w:spacing w:after="80" w:before="80"/>
+      </w:pPr>
+      <w:r>
+        <w:t xml:space="preserve"/>
+      </w:r>
+    </w:p>
+    <w:p>
+      <w:pPr>
+        <w:pStyle w:val="Heading1"/>
+        <w:spacing w:after="120" w:before="360"/>
+      </w:pPr>
+      <w:r>
+        <w:rPr>
+          <w:rFonts w:ascii="Arial" w:cs="Arial" w:eastAsia="Arial" w:hAnsi="Arial"/>
+          <w:b/>
+          <w:bCs/>
+          <w:sz w:val="28"/>
+          <w:szCs w:val="28"/>
+        </w:rPr>
+        <w:t xml:space="preserve">4. Authentication</w:t>
+      </w:r>
+    </w:p>
+    <w:tbl>
+      <w:tblPr>
+        <w:tblW w:type="dxa" w:w="9360"/>
+        <w:tblBorders>
+          <w:top w:val="single" w:color="auto" w:sz="4"/>
+          <w:left w:val="single" w:color="auto" w:sz="4"/>
+          <w:bottom w:val="single" w:color="auto" w:sz="4"/>
+          <w:right w:val="single" w:color="auto" w:sz="4"/>
+          <w:insideH w:val="single" w:color="auto" w:sz="4"/>
+          <w:insideV w:val="single" w:color="auto" w:sz="4"/>
+        </w:tblBorders>
+      </w:tblPr>
+      <w:tblGrid>
+        <w:gridCol w:w="4680"/>
+        <w:gridCol w:w="4680"/>
+      </w:tblGrid>
+      <w:tr>
+        <w:tc>
+          <w:tcPr>
+            <w:tcW w:type="dxa" w:w="4680"/>
+            <w:tcBorders>
+              <w:top w:val="single" w:color="CCCCCC" w:sz="1"/>
+              <w:left w:val="single" w:color="CCCCCC" w:sz="1"/>
+              <w:bottom w:val="single" w:color="CCCCCC" w:sz="1"/>
+              <w:right w:val="single" w:color="CCCCCC" w:sz="1"/>
+            </w:tcBorders>
+            <w:shd w:fill="2E4057" w:val="clear"/>
+            <w:tcMar>
+              <w:top w:type="dxa" w:w="80"/>
+              <w:left w:type="dxa" w:w="120"/>
+              <w:bottom w:type="dxa" w:w="80"/>
+              <w:right w:type="dxa" w:w="120"/>
+            </w:tcMar>
+          </w:tcPr>
+          <w:p>
+            <w:r>
+              <w:rPr>
+                <w:rFonts w:ascii="Arial" w:cs="Arial" w:eastAsia="Arial" w:hAnsi="Arial"/>
+                <w:b/>
+                <w:bCs/>
+                <w:color w:val="FFFFFF"/>
+                <w:sz w:val="20"/>
+                <w:szCs w:val="20"/>
+              </w:rPr>
+              <w:t xml:space="preserve">Direction</w:t>
+            </w:r>
+          </w:p>
+        </w:tc>
+        <w:tc>
+          <w:tcPr>
+            <w:tcW w:type="dxa" w:w="4680"/>
+            <w:tcBorders>
+              <w:top w:val="single" w:color="CCCCCC" w:sz="1"/>
+              <w:left w:val="single" w:color="CCCCCC" w:sz="1"/>
+              <w:bottom w:val="single" w:color="CCCCCC" w:sz="1"/>
+              <w:right w:val="single" w:color="CCCCCC" w:sz="1"/>
+            </w:tcBorders>
+            <w:shd w:fill="2E4057" w:val="clear"/>
+            <w:tcMar>
+              <w:top w:type="dxa" w:w="80"/>
+              <w:left w:type="dxa" w:w="120"/>
+              <w:bottom w:type="dxa" w:w="80"/>
+              <w:right w:type="dxa" w:w="120"/>
+            </w:tcMar>
+          </w:tcPr>
+          <w:p>
+            <w:r>
+              <w:rPr>
+                <w:rFonts w:ascii="Arial" w:cs="Arial" w:eastAsia="Arial" w:hAnsi="Arial"/>
+                <w:b/>
+                <w:bCs/>
+                <w:color w:val="FFFFFF"/>
+                <w:sz w:val="20"/>
+                <w:szCs w:val="20"/>
+              </w:rPr>
+              <w:t xml:space="preserve">Method</w:t>
+            </w:r>
+          </w:p>
+        </w:tc>
+      </w:tr>
+      <w:tr>
+        <w:tc>
+          <w:tcPr>
+            <w:tcW w:type="dxa" w:w="4680"/>
+            <w:tcBorders>
+              <w:top w:val="single" w:color="CCCCCC" w:sz="1"/>
+              <w:left w:val="single" w:color="CCCCCC" w:sz="1"/>
+              <w:bottom w:val="single" w:color="CCCCCC" w:sz="1"/>
+              <w:right w:val="single" w:color="CCCCCC" w:sz="1"/>
+            </w:tcBorders>
+            <w:shd w:fill="FFFFFF" w:val="clear"/>
+            <w:tcMar>
+              <w:top w:type="dxa" w:w="80"/>
+              <w:left w:type="dxa" w:w="120"/>
+              <w:bottom w:type="dxa" w:w="80"/>
+              <w:right w:type="dxa" w:w="120"/>
+            </w:tcMar>
+          </w:tcPr>
+          <w:p>
+            <w:r>
+              <w:rPr>
+                <w:rFonts w:ascii="Arial" w:cs="Arial" w:eastAsia="Arial" w:hAnsi="Arial"/>
+                <w:b w:val="false"/>
+                <w:bCs w:val="false"/>
+                <w:color w:val="000000"/>
+                <w:sz w:val="20"/>
+                <w:szCs w:val="20"/>
+              </w:rPr>
+              <w:t xml:space="preserve">Our server → Ride Control API</w:t>
+            </w:r>
+          </w:p>
+        </w:tc>
+        <w:tc>
+          <w:tcPr>
+            <w:tcW w:type="dxa" w:w="4680"/>
+            <w:tcBorders>
+              <w:top w:val="single" w:color="CCCCCC" w:sz="1"/>
+              <w:left w:val="single" w:color="CCCCCC" w:sz="1"/>
+              <w:bottom w:val="single" w:color="CCCCCC" w:sz="1"/>
+              <w:right w:val="single" w:color="CCCCCC" w:sz="1"/>
+            </w:tcBorders>
+            <w:shd w:fill="FFFFFF" w:val="clear"/>
+            <w:tcMar>
+              <w:top w:type="dxa" w:w="80"/>
+              <w:left w:type="dxa" w:w="120"/>
+              <w:bottom w:type="dxa" w:w="80"/>
+              <w:right w:type="dxa" w:w="120"/>
+            </w:tcMar>
+          </w:tcPr>
+          <w:p>
+            <w:r>
+              <w:rPr>
+                <w:rFonts w:ascii="Arial" w:cs="Arial" w:eastAsia="Arial" w:hAnsi="Arial"/>
+                <w:b w:val="false"/>
+                <w:bCs w:val="false"/>
+                <w:color w:val="000000"/>
+                <w:sz w:val="20"/>
+                <w:szCs w:val="20"/>
+              </w:rPr>
+              <w:t xml:space="preserve">Existing SUPPLIER_API_TOKEN in Authorization header — already in use</w:t>
+            </w:r>
+          </w:p>
+        </w:tc>
+      </w:tr>
+      <w:tr>
+        <w:tc>
+          <w:tcPr>
+            <w:tcW w:type="dxa" w:w="4680"/>
+            <w:tcBorders>
+              <w:top w:val="single" w:color="CCCCCC" w:sz="1"/>
+              <w:left w:val="single" w:color="CCCCCC" w:sz="1"/>
+              <w:bottom w:val="single" w:color="CCCCCC" w:sz="1"/>
+              <w:right w:val="single" w:color="CCCCCC" w:sz="1"/>
+            </w:tcBorders>
+            <w:shd w:fill="FFFFFF" w:val="clear"/>
+            <w:tcMar>
+              <w:top w:type="dxa" w:w="80"/>
+              <w:left w:type="dxa" w:w="120"/>
+              <w:bottom w:type="dxa" w:w="80"/>
+              <w:right w:type="dxa" w:w="120"/>
+            </w:tcMar>
+          </w:tcPr>
+          <w:p>
+            <w:r>
+              <w:rPr>
+                <w:rFonts w:ascii="Arial" w:cs="Arial" w:eastAsia="Arial" w:hAnsi="Arial"/>
+                <w:b w:val="false"/>
+                <w:bCs w:val="false"/>
+                <w:color w:val="000000"/>
+                <w:sz w:val="20"/>
+                <w:szCs w:val="20"/>
+              </w:rPr>
+              <w:t xml:space="preserve">Ride Control → our server (callback)</w:t>
+            </w:r>
+          </w:p>
+        </w:tc>
+        <w:tc>
+          <w:tcPr>
+            <w:tcW w:type="dxa" w:w="4680"/>
+            <w:tcBorders>
+              <w:top w:val="single" w:color="CCCCCC" w:sz="1"/>
+              <w:left w:val="single" w:color="CCCCCC" w:sz="1"/>
+              <w:bottom w:val="single" w:color="CCCCCC" w:sz="1"/>
+              <w:right w:val="single" w:color="CCCCCC" w:sz="1"/>
+            </w:tcBorders>
+            <w:shd w:fill="FFFFFF" w:val="clear"/>
+            <w:tcMar>
+              <w:top w:type="dxa" w:w="80"/>
+              <w:left w:type="dxa" w:w="120"/>
+              <w:bottom w:type="dxa" w:w="80"/>
+              <w:right w:type="dxa" w:w="120"/>
+            </w:tcMar>
+          </w:tcPr>
+          <w:p>
+            <w:r>
+              <w:rPr>
+                <w:rFonts w:ascii="Arial" w:cs="Arial" w:eastAsia="Arial" w:hAnsi="Arial"/>
+                <w:b w:val="false"/>
+                <w:bCs w:val="false"/>
+                <w:color w:val="000000"/>
+                <w:sz w:val="20"/>
+                <w:szCs w:val="20"/>
+              </w:rPr>
+              <w:t xml:space="preserve">Shared secret Bearer token — we generate and provide it to you</w:t>
+            </w:r>
+          </w:p>
+        </w:tc>
+      </w:tr>
+    </w:tbl>
     <w:p>
       <w:pPr>
         <w:spacing w:after="80" w:before="80"/>
@@ -1987,7 +2221,7 @@
                 <w:sz w:val="20"/>
                 <w:szCs w:val="20"/>
               </w:rPr>
-              <w:t xml:space="preserve">Webhook delivery</w:t>
+              <w:t xml:space="preserve">Driver write-back</w:t>
             </w:r>
           </w:p>
         </w:tc>
@@ -2018,7 +2252,7 @@
                 <w:sz w:val="20"/>
                 <w:szCs w:val="20"/>
               </w:rPr>
-              <w:t xml:space="preserve">Ride Control sends a test booking to our staging URL</w:t>
+              <w:t xml:space="preserve">Agent calls /assigndriver and /updatefields on a test booking</w:t>
             </w:r>
           </w:p>
         </w:tc>
@@ -2049,7 +2283,7 @@
                 <w:sz w:val="20"/>
                 <w:szCs w:val="20"/>
               </w:rPr>
-              <w:t xml:space="preserve">Agent queues trip, returns 200</w:t>
+              <w:t xml:space="preserve">Ride Control shows assigned driver and note</w:t>
             </w:r>
           </w:p>
         </w:tc>
@@ -2082,7 +2316,7 @@
                 <w:sz w:val="20"/>
                 <w:szCs w:val="20"/>
               </w:rPr>
-              <w:t xml:space="preserve">Driver write-back</w:t>
+              <w:t xml:space="preserve">Approval link</w:t>
             </w:r>
           </w:p>
         </w:tc>
@@ -2113,7 +2347,7 @@
                 <w:sz w:val="20"/>
                 <w:szCs w:val="20"/>
               </w:rPr>
-              <w:t xml:space="preserve">Agent calls /driver and /notes on a test booking</w:t>
+              <w:t xml:space="preserve">Driver clicks Approve on staging page</w:t>
             </w:r>
           </w:p>
         </w:tc>
@@ -2144,7 +2378,7 @@
                 <w:sz w:val="20"/>
                 <w:szCs w:val="20"/>
               </w:rPr>
-              <w:t xml:space="preserve">Ride Control shows assigned driver and note</w:t>
+              <w:t xml:space="preserve">Our server receives callback, trip moves to confirmed</w:t>
             </w:r>
           </w:p>
         </w:tc>
@@ -2177,7 +2411,7 @@
                 <w:sz w:val="20"/>
                 <w:szCs w:val="20"/>
               </w:rPr>
-              <w:t xml:space="preserve">Approval link flow</w:t>
+              <w:t xml:space="preserve">Decline via link</w:t>
             </w:r>
           </w:p>
         </w:tc>
@@ -2208,7 +2442,7 @@
                 <w:sz w:val="20"/>
                 <w:szCs w:val="20"/>
               </w:rPr>
-              <w:t xml:space="preserve">Driver clicks approve on staging</w:t>
+              <w:t xml:space="preserve">Driver clicks Decline on staging page</w:t>
             </w:r>
           </w:p>
         </w:tc>
@@ -2239,7 +2473,7 @@
                 <w:sz w:val="20"/>
                 <w:szCs w:val="20"/>
               </w:rPr>
-              <w:t xml:space="preserve">Our server receives callback, trip moves to confirmed</w:t>
+              <w:t xml:space="preserve">Our server re-queues trip to next driver</w:t>
             </w:r>
           </w:p>
         </w:tc>
@@ -2272,7 +2506,7 @@
                 <w:sz w:val="20"/>
                 <w:szCs w:val="20"/>
               </w:rPr>
-              <w:t xml:space="preserve">Decline flow</w:t>
+              <w:t xml:space="preserve">WhatsApp YES but no link click</w:t>
             </w:r>
           </w:p>
         </w:tc>
@@ -2303,7 +2537,7 @@
                 <w:sz w:val="20"/>
                 <w:szCs w:val="20"/>
               </w:rPr>
-              <w:t xml:space="preserve">Driver clicks decline on staging</w:t>
+              <w:t xml:space="preserve">Driver replies YES, link not clicked for 65 min</w:t>
             </w:r>
           </w:p>
         </w:tc>
@@ -2334,102 +2568,7 @@
                 <w:sz w:val="20"/>
                 <w:szCs w:val="20"/>
               </w:rPr>
-              <w:t xml:space="preserve">Our server re-queues trip to next driver</w:t>
-            </w:r>
-          </w:p>
-        </w:tc>
-      </w:tr>
-      <w:tr>
-        <w:tc>
-          <w:tcPr>
-            <w:tcW w:type="dxa" w:w="3120"/>
-            <w:tcBorders>
-              <w:top w:val="single" w:color="CCCCCC" w:sz="1"/>
-              <w:left w:val="single" w:color="CCCCCC" w:sz="1"/>
-              <w:bottom w:val="single" w:color="CCCCCC" w:sz="1"/>
-              <w:right w:val="single" w:color="CCCCCC" w:sz="1"/>
-            </w:tcBorders>
-            <w:shd w:fill="FFFFFF" w:val="clear"/>
-            <w:tcMar>
-              <w:top w:type="dxa" w:w="80"/>
-              <w:left w:type="dxa" w:w="120"/>
-              <w:bottom w:type="dxa" w:w="80"/>
-              <w:right w:type="dxa" w:w="120"/>
-            </w:tcMar>
-          </w:tcPr>
-          <w:p>
-            <w:r>
-              <w:rPr>
-                <w:rFonts w:ascii="Arial" w:cs="Arial" w:eastAsia="Arial" w:hAnsi="Arial"/>
-                <w:b w:val="false"/>
-                <w:bCs w:val="false"/>
-                <w:color w:val="000000"/>
-                <w:sz w:val="20"/>
-                <w:szCs w:val="20"/>
-              </w:rPr>
-              <w:t xml:space="preserve">Timeout (no click)</w:t>
-            </w:r>
-          </w:p>
-        </w:tc>
-        <w:tc>
-          <w:tcPr>
-            <w:tcW w:type="dxa" w:w="3120"/>
-            <w:tcBorders>
-              <w:top w:val="single" w:color="CCCCCC" w:sz="1"/>
-              <w:left w:val="single" w:color="CCCCCC" w:sz="1"/>
-              <w:bottom w:val="single" w:color="CCCCCC" w:sz="1"/>
-              <w:right w:val="single" w:color="CCCCCC" w:sz="1"/>
-            </w:tcBorders>
-            <w:shd w:fill="FFFFFF" w:val="clear"/>
-            <w:tcMar>
-              <w:top w:type="dxa" w:w="80"/>
-              <w:left w:type="dxa" w:w="120"/>
-              <w:bottom w:type="dxa" w:w="80"/>
-              <w:right w:type="dxa" w:w="120"/>
-            </w:tcMar>
-          </w:tcPr>
-          <w:p>
-            <w:r>
-              <w:rPr>
-                <w:rFonts w:ascii="Arial" w:cs="Arial" w:eastAsia="Arial" w:hAnsi="Arial"/>
-                <w:b w:val="false"/>
-                <w:bCs w:val="false"/>
-                <w:color w:val="000000"/>
-                <w:sz w:val="20"/>
-                <w:szCs w:val="20"/>
-              </w:rPr>
-              <w:t xml:space="preserve">Driver approves WhatsApp but link not clicked for 65 min</w:t>
-            </w:r>
-          </w:p>
-        </w:tc>
-        <w:tc>
-          <w:tcPr>
-            <w:tcW w:type="dxa" w:w="3120"/>
-            <w:tcBorders>
-              <w:top w:val="single" w:color="CCCCCC" w:sz="1"/>
-              <w:left w:val="single" w:color="CCCCCC" w:sz="1"/>
-              <w:bottom w:val="single" w:color="CCCCCC" w:sz="1"/>
-              <w:right w:val="single" w:color="CCCCCC" w:sz="1"/>
-            </w:tcBorders>
-            <w:shd w:fill="FFFFFF" w:val="clear"/>
-            <w:tcMar>
-              <w:top w:type="dxa" w:w="80"/>
-              <w:left w:type="dxa" w:w="120"/>
-              <w:bottom w:type="dxa" w:w="80"/>
-              <w:right w:type="dxa" w:w="120"/>
-            </w:tcMar>
-          </w:tcPr>
-          <w:p>
-            <w:r>
-              <w:rPr>
-                <w:rFonts w:ascii="Arial" w:cs="Arial" w:eastAsia="Arial" w:hAnsi="Arial"/>
-                <w:b w:val="false"/>
-                <w:bCs w:val="false"/>
-                <w:color w:val="000000"/>
-                <w:sz w:val="20"/>
-                <w:szCs w:val="20"/>
-              </w:rPr>
-              <w:t xml:space="preserve">Agent suspends + alerts Michel</w:t>
+              <w:t xml:space="preserve">Agent suspends booking, Michel receives WhatsApp alert</w:t>
             </w:r>
           </w:p>
         </w:tc>
@@ -2598,7 +2737,7 @@
                 <w:sz w:val="20"/>
                 <w:szCs w:val="20"/>
               </w:rPr>
-              <w:t xml:space="preserve">Confirm endpoint paths and auth scheme. Share staging URLs.</w:t>
+              <w:t xml:space="preserve">Confirm write-back endpoint paths and drivercode format. Share staging URLs.</w:t>
             </w:r>
           </w:p>
         </w:tc>
@@ -2662,7 +2801,7 @@
                 <w:sz w:val="20"/>
                 <w:szCs w:val="20"/>
               </w:rPr>
-              <w:t xml:space="preserve">Ride Control implements webhook push. Our agent receives and processes.</w:t>
+              <w:t xml:space="preserve">Write-back tested end-to-end in staging — assign driver and add note.</w:t>
             </w:r>
           </w:p>
         </w:tc>
@@ -2726,7 +2865,7 @@
                 <w:sz w:val="20"/>
                 <w:szCs w:val="20"/>
               </w:rPr>
-              <w:t xml:space="preserve">Driver write-back tested end-to-end in staging.</w:t>
+              <w:t xml:space="preserve">Approval page URL format confirmed. Callback endpoint implemented by your team.</w:t>
             </w:r>
           </w:p>
         </w:tc>
@@ -2790,7 +2929,7 @@
                 <w:sz w:val="20"/>
                 <w:szCs w:val="20"/>
               </w:rPr>
-              <w:t xml:space="preserve">Approval link flow implemented and tested. Decline + timeout paths verified.</w:t>
+              <w:t xml:space="preserve">Full approval flow tested: approve, decline, and 1-hour timeout paths.</w:t>
             </w:r>
           </w:p>
         </w:tc>
@@ -2881,7 +3020,7 @@
           <w:sz w:val="28"/>
           <w:szCs w:val="28"/>
         </w:rPr>
-        <w:t xml:space="preserve">7. Open Questions for Your Team</w:t>
+        <w:t xml:space="preserve">7. Open Questions</w:t>
       </w:r>
     </w:p>
     <w:p>
@@ -2899,7 +3038,7 @@
           <w:sz w:val="22"/>
           <w:szCs w:val="22"/>
         </w:rPr>
-        <w:t xml:space="preserve">What is the exact format of driver_id in your system — internal UUID, phone number, or employee ID?</w:t>
+        <w:t xml:space="preserve">What format is drivercode — internal ID, phone, or employee number?</w:t>
       </w:r>
     </w:p>
     <w:p>
@@ -2917,7 +3056,7 @@
           <w:sz w:val="22"/>
           <w:szCs w:val="22"/>
         </w:rPr>
-        <w:t xml:space="preserve">Is there an existing driver approval page we can link to, or do you need to build one?</w:t>
+        <w:t xml:space="preserve">Is there an existing driver approval page we can link to, or does one need to be built?</w:t>
       </w:r>
     </w:p>
     <w:p>
@@ -2935,7 +3074,7 @@
           <w:sz w:val="22"/>
           <w:szCs w:val="22"/>
         </w:rPr>
-        <w:t xml:space="preserve">Can the approval callback carry a custom token we generate, so we can link it back to our offer record?</w:t>
+        <w:t xml:space="preserve">Can the approval callback include a token we generate, so we can match it to our offer record?</w:t>
       </w:r>
     </w:p>
     <w:p>
@@ -2953,25 +3092,7 @@
           <w:sz w:val="22"/>
           <w:szCs w:val="22"/>
         </w:rPr>
-        <w:t xml:space="preserve">Do you prefer push (you call us) or poll (we call you on an interval) for the approval status?</w:t>
-      </w:r>
-    </w:p>
-    <w:p>
-      <w:pPr>
-        <w:pStyle w:val="ListParagraph"/>
-        <w:numPr>
-          <w:ilvl w:val="0"/>
-          <w:numId w:val="1"/>
-        </w:numPr>
-        <w:spacing w:after="40" w:before="40"/>
-      </w:pPr>
-      <w:r>
-        <w:rPr>
-          <w:rFonts w:ascii="Arial" w:cs="Arial" w:eastAsia="Arial" w:hAnsi="Arial"/>
-          <w:sz w:val="22"/>
-          <w:szCs w:val="22"/>
-        </w:rPr>
-        <w:t xml:space="preserve">Are there rate limits on the supplier API we should be aware of?</w:t>
+        <w:t xml:space="preserve">Are there any rate limits on the supplier API?</w:t>
       </w:r>
     </w:p>
     <w:p>
@@ -3008,7 +3129,7 @@
           <w:sz w:val="22"/>
           <w:szCs w:val="22"/>
         </w:rPr>
-        <w:t xml:space="preserve">For technical coordination, reach out to:</w:t>
+        <w:t xml:space="preserve">Dan Azaryad — azaryad@gmail.com</w:t>
       </w:r>
     </w:p>
     <w:p>
@@ -3021,20 +3142,7 @@
           <w:sz w:val="22"/>
           <w:szCs w:val="22"/>
         </w:rPr>
-        <w:t xml:space="preserve">Dan Azaryad — azaryad@gmail.com</w:t>
-      </w:r>
-    </w:p>
-    <w:p>
-      <w:pPr>
-        <w:spacing w:after="80" w:before="80"/>
-      </w:pPr>
-      <w:r>
-        <w:rPr>
-          <w:rFonts w:ascii="Arial" w:cs="Arial" w:eastAsia="Arial" w:hAnsi="Arial"/>
-          <w:sz w:val="22"/>
-          <w:szCs w:val="22"/>
-        </w:rPr>
-        <w:t xml:space="preserve">We are happy to arrange a short technical call to walk through the API contracts together.</w:t>
+        <w:t xml:space="preserve">Happy to arrange a short technical call to walk through the API contracts.</w:t>
       </w:r>
     </w:p>
     <w:p>

</xml_diff>

<commit_message>
Mark approval callback as required, not optional
Without the callback the agent cannot automate approve/decline/timeout
flows — dispatcher would need to intervene on every booking manually.

Co-Authored-By: Claude Opus 4.7 <noreply@anthropic.com>
</commit_message>
<xml_diff>
--- a/docs/Integration_Proposal.docx
+++ b/docs/Integration_Proposal.docx
@@ -45,7 +45,7 @@
           <w:sz w:val="20"/>
           <w:szCs w:val="20"/>
         </w:rPr>
-        <w:t xml:space="preserve">Version 1.2  |  May 2026  |  Confidential</w:t>
+        <w:t xml:space="preserve">Version 1.3  |  May 2026  |  Confidential</w:t>
       </w:r>
     </w:p>
     <w:p>
@@ -87,7 +87,7 @@
           <w:sz w:val="22"/>
           <w:szCs w:val="22"/>
         </w:rPr>
-        <w:t xml:space="preserve">The agent sends each driver a WhatsApp message describing the ride and asking them to confirm. Everything on our side is production-ready. The only missing piece is a way to generate an official confirmation link inside Ride Control that we can include in that WhatsApp message.</w:t>
+        <w:t xml:space="preserve">The agent sends each driver a WhatsApp message describing the ride and asking them to confirm. Everything on our side is production-ready. We need two things from Ride Control to complete the integration: a booking approval link to send the driver, and a callback when the driver acts on that link.</w:t>
       </w:r>
     </w:p>
     <w:p>
@@ -685,7 +685,7 @@
           <w:sz w:val="28"/>
           <w:szCs w:val="28"/>
         </w:rPr>
-        <w:t xml:space="preserve">3. The One Thing We Need</w:t>
+        <w:t xml:space="preserve">3. Required — Booking Approval Link</w:t>
       </w:r>
     </w:p>
     <w:p>
@@ -698,7 +698,7 @@
           <w:sz w:val="22"/>
           <w:szCs w:val="22"/>
         </w:rPr>
-        <w:t xml:space="preserve">We need a booking approval link — a URL that we can include in the driver's WhatsApp message so they can officially confirm the ride inside Ride Control.</w:t>
+        <w:t xml:space="preserve">We need a URL to include in the driver's WhatsApp message so they can officially confirm the ride inside Ride Control. A WhatsApp reply alone is not sufficient — the driver must confirm through the platform.</w:t>
       </w:r>
     </w:p>
     <w:p>
@@ -840,7 +840,7 @@
           <w:sz w:val="22"/>
           <w:szCs w:val="22"/>
         </w:rPr>
-        <w:t xml:space="preserve">We need you to tell us:</w:t>
+        <w:t xml:space="preserve">Questions:</w:t>
       </w:r>
     </w:p>
     <w:p>
@@ -918,7 +918,7 @@
           <w:sz w:val="28"/>
           <w:szCs w:val="28"/>
         </w:rPr>
-        <w:t xml:space="preserve">4. Optional — Approval Callback</w:t>
+        <w:t xml:space="preserve">4. Required — Approval Callback</w:t>
       </w:r>
     </w:p>
     <w:p>
@@ -931,7 +931,15 @@
           <w:sz w:val="22"/>
           <w:szCs w:val="22"/>
         </w:rPr>
-        <w:t xml:space="preserve">If possible, it would be helpful if Ride Control could send us a notification when the driver approves or declines via the link. This would allow our agent to react instantly — confirm the booking, or re-offer to the next driver automatically.</w:t>
+        <w:t xml:space="preserve">When the driver acts on the approval link, Ride Control must POST a callback to our server. This is required — without it, our agent has no way to know whether the driver approved or declined, and cannot proceed automatically.</w:t>
+      </w:r>
+    </w:p>
+    <w:p>
+      <w:pPr>
+        <w:spacing w:after="80" w:before="80"/>
+      </w:pPr>
+      <w:r>
+        <w:t xml:space="preserve"/>
       </w:r>
     </w:p>
     <w:p>
@@ -944,7 +952,82 @@
           <w:sz w:val="22"/>
           <w:szCs w:val="22"/>
         </w:rPr>
-        <w:t xml:space="preserve">This is not a hard requirement. If it is complex to build, we can handle it manually through the dashboard for now and revisit later.</w:t>
+        <w:t xml:space="preserve">Why it matters:</w:t>
+      </w:r>
+    </w:p>
+    <w:p>
+      <w:pPr>
+        <w:pStyle w:val="ListParagraph"/>
+        <w:numPr>
+          <w:ilvl w:val="0"/>
+          <w:numId w:val="1"/>
+        </w:numPr>
+        <w:spacing w:after="40" w:before="40"/>
+      </w:pPr>
+      <w:r>
+        <w:rPr>
+          <w:rFonts w:ascii="Arial" w:cs="Arial" w:eastAsia="Arial" w:hAnsi="Arial"/>
+          <w:sz w:val="22"/>
+          <w:szCs w:val="22"/>
+        </w:rPr>
+        <w:t xml:space="preserve">Approved → our agent confirms the booking, assigns the driver, and writes back to Ride Control.</w:t>
+      </w:r>
+    </w:p>
+    <w:p>
+      <w:pPr>
+        <w:pStyle w:val="ListParagraph"/>
+        <w:numPr>
+          <w:ilvl w:val="0"/>
+          <w:numId w:val="1"/>
+        </w:numPr>
+        <w:spacing w:after="40" w:before="40"/>
+      </w:pPr>
+      <w:r>
+        <w:rPr>
+          <w:rFonts w:ascii="Arial" w:cs="Arial" w:eastAsia="Arial" w:hAnsi="Arial"/>
+          <w:sz w:val="22"/>
+          <w:szCs w:val="22"/>
+        </w:rPr>
+        <w:t xml:space="preserve">Declined → our agent immediately re-offers the ride to the next available driver.</w:t>
+      </w:r>
+    </w:p>
+    <w:p>
+      <w:pPr>
+        <w:pStyle w:val="ListParagraph"/>
+        <w:numPr>
+          <w:ilvl w:val="0"/>
+          <w:numId w:val="1"/>
+        </w:numPr>
+        <w:spacing w:after="40" w:before="40"/>
+      </w:pPr>
+      <w:r>
+        <w:rPr>
+          <w:rFonts w:ascii="Arial" w:cs="Arial" w:eastAsia="Arial" w:hAnsi="Arial"/>
+          <w:sz w:val="22"/>
+          <w:szCs w:val="22"/>
+        </w:rPr>
+        <w:t xml:space="preserve">No action within 1 hour of the driver's WhatsApp YES → our agent suspends the booking and alerts the dispatcher.</w:t>
+      </w:r>
+    </w:p>
+    <w:p>
+      <w:pPr>
+        <w:spacing w:after="80" w:before="80"/>
+      </w:pPr>
+      <w:r>
+        <w:t xml:space="preserve"/>
+      </w:r>
+    </w:p>
+    <w:p>
+      <w:pPr>
+        <w:spacing w:after="80" w:before="80"/>
+      </w:pPr>
+      <w:r>
+        <w:rPr>
+          <w:rFonts w:ascii="Arial" w:cs="Arial" w:eastAsia="Arial" w:hAnsi="Arial"/>
+          <w:sz w:val="22"/>
+          <w:szCs w:val="22"/>
+        </w:rPr>
+        <w:t xml:space="preserve">None of these flows can run without the callback. The dispatcher would have to intervene manually on every single booking, which defeats the purpose of the system.</w:t>
       </w:r>
     </w:p>
     <w:p>
@@ -967,7 +1050,7 @@
           <w:sz w:val="22"/>
           <w:szCs w:val="22"/>
         </w:rPr>
-        <w:t xml:space="preserve">If you do want to implement it, the callback would be:</w:t>
+        <w:t xml:space="preserve">Callback specification:</w:t>
       </w:r>
     </w:p>
     <w:p>
@@ -1009,7 +1092,7 @@
           <w:sz w:val="18"/>
           <w:szCs w:val="18"/>
         </w:rPr>
-        <w:t xml:space="preserve">{</w:t>
+        <w:t xml:space="preserve">Headers:</w:t>
       </w:r>
     </w:p>
     <w:p>
@@ -1023,7 +1106,7 @@
           <w:sz w:val="18"/>
           <w:szCs w:val="18"/>
         </w:rPr>
-        <w:t xml:space="preserve">  "booking_id":  "RC-20045",</w:t>
+        <w:t xml:space="preserve">  Authorization: Bearer &lt;shared_secret&gt;</w:t>
       </w:r>
     </w:p>
     <w:p>
@@ -1037,7 +1120,7 @@
           <w:sz w:val="18"/>
           <w:szCs w:val="18"/>
         </w:rPr>
-        <w:t xml:space="preserve">  "status":      "approved" | "declined",</w:t>
+        <w:t xml:space="preserve">  Content-Type: application/json</w:t>
       </w:r>
     </w:p>
     <w:p>
@@ -1051,7 +1134,7 @@
           <w:sz w:val="18"/>
           <w:szCs w:val="18"/>
         </w:rPr>
-        <w:t xml:space="preserve">  "timestamp":   "2026-05-10T09:15:00+03:00"</w:t>
+        <w:t xml:space="preserve"/>
       </w:r>
     </w:p>
     <w:p>
@@ -1065,7 +1148,140 @@
           <w:sz w:val="18"/>
           <w:szCs w:val="18"/>
         </w:rPr>
+        <w:t xml:space="preserve">Body:</w:t>
+      </w:r>
+    </w:p>
+    <w:p>
+      <w:pPr>
+        <w:shd w:fill="F2F2F2" w:val="clear"/>
+        <w:spacing w:after="0" w:before="0"/>
+      </w:pPr>
+      <w:r>
+        <w:rPr>
+          <w:rFonts w:ascii="Courier New" w:cs="Courier New" w:eastAsia="Courier New" w:hAnsi="Courier New"/>
+          <w:sz w:val="18"/>
+          <w:szCs w:val="18"/>
+        </w:rPr>
+        <w:t xml:space="preserve">{</w:t>
+      </w:r>
+    </w:p>
+    <w:p>
+      <w:pPr>
+        <w:shd w:fill="F2F2F2" w:val="clear"/>
+        <w:spacing w:after="0" w:before="0"/>
+      </w:pPr>
+      <w:r>
+        <w:rPr>
+          <w:rFonts w:ascii="Courier New" w:cs="Courier New" w:eastAsia="Courier New" w:hAnsi="Courier New"/>
+          <w:sz w:val="18"/>
+          <w:szCs w:val="18"/>
+        </w:rPr>
+        <w:t xml:space="preserve">  "booking_id":  "RC-20045",</w:t>
+      </w:r>
+    </w:p>
+    <w:p>
+      <w:pPr>
+        <w:shd w:fill="F2F2F2" w:val="clear"/>
+        <w:spacing w:after="0" w:before="0"/>
+      </w:pPr>
+      <w:r>
+        <w:rPr>
+          <w:rFonts w:ascii="Courier New" w:cs="Courier New" w:eastAsia="Courier New" w:hAnsi="Courier New"/>
+          <w:sz w:val="18"/>
+          <w:szCs w:val="18"/>
+        </w:rPr>
+        <w:t xml:space="preserve">  "status":      "approved" | "declined",</w:t>
+      </w:r>
+    </w:p>
+    <w:p>
+      <w:pPr>
+        <w:shd w:fill="F2F2F2" w:val="clear"/>
+        <w:spacing w:after="0" w:before="0"/>
+      </w:pPr>
+      <w:r>
+        <w:rPr>
+          <w:rFonts w:ascii="Courier New" w:cs="Courier New" w:eastAsia="Courier New" w:hAnsi="Courier New"/>
+          <w:sz w:val="18"/>
+          <w:szCs w:val="18"/>
+        </w:rPr>
+        <w:t xml:space="preserve">  "timestamp":   "2026-05-10T09:15:00+03:00"</w:t>
+      </w:r>
+    </w:p>
+    <w:p>
+      <w:pPr>
+        <w:shd w:fill="F2F2F2" w:val="clear"/>
+        <w:spacing w:after="0" w:before="0"/>
+      </w:pPr>
+      <w:r>
+        <w:rPr>
+          <w:rFonts w:ascii="Courier New" w:cs="Courier New" w:eastAsia="Courier New" w:hAnsi="Courier New"/>
+          <w:sz w:val="18"/>
+          <w:szCs w:val="18"/>
+        </w:rPr>
         <w:t xml:space="preserve">}</w:t>
+      </w:r>
+    </w:p>
+    <w:p>
+      <w:pPr>
+        <w:shd w:fill="F2F2F2" w:val="clear"/>
+        <w:spacing w:after="0" w:before="0"/>
+      </w:pPr>
+      <w:r>
+        <w:rPr>
+          <w:rFonts w:ascii="Courier New" w:cs="Courier New" w:eastAsia="Courier New" w:hAnsi="Courier New"/>
+          <w:sz w:val="18"/>
+          <w:szCs w:val="18"/>
+        </w:rPr>
+        <w:t xml:space="preserve"/>
+      </w:r>
+    </w:p>
+    <w:p>
+      <w:pPr>
+        <w:shd w:fill="F2F2F2" w:val="clear"/>
+        <w:spacing w:after="0" w:before="0"/>
+      </w:pPr>
+      <w:r>
+        <w:rPr>
+          <w:rFonts w:ascii="Courier New" w:cs="Courier New" w:eastAsia="Courier New" w:hAnsi="Courier New"/>
+          <w:sz w:val="18"/>
+          <w:szCs w:val="18"/>
+        </w:rPr>
+        <w:t xml:space="preserve">Expected response:</w:t>
+      </w:r>
+    </w:p>
+    <w:p>
+      <w:pPr>
+        <w:shd w:fill="F2F2F2" w:val="clear"/>
+        <w:spacing w:after="0" w:before="0"/>
+      </w:pPr>
+      <w:r>
+        <w:rPr>
+          <w:rFonts w:ascii="Courier New" w:cs="Courier New" w:eastAsia="Courier New" w:hAnsi="Courier New"/>
+          <w:sz w:val="18"/>
+          <w:szCs w:val="18"/>
+        </w:rPr>
+        <w:t xml:space="preserve">  200 OK</w:t>
+      </w:r>
+    </w:p>
+    <w:p>
+      <w:pPr>
+        <w:spacing w:after="80" w:before="80"/>
+      </w:pPr>
+      <w:r>
+        <w:t xml:space="preserve"/>
+      </w:r>
+    </w:p>
+    <w:p>
+      <w:pPr>
+        <w:spacing w:after="80" w:before="80"/>
+      </w:pPr>
+      <w:r>
+        <w:rPr>
+          <w:rFonts w:ascii="Arial" w:cs="Arial" w:eastAsia="Arial" w:hAnsi="Arial"/>
+          <w:sz w:val="22"/>
+          <w:szCs w:val="22"/>
+        </w:rPr>
+        <w:t xml:space="preserve">Auth: we will provide a shared Bearer token. You include it in the Authorization header on every callback call.</w:t>
       </w:r>
     </w:p>
     <w:p>
@@ -1089,7 +1305,7 @@
           <w:sz w:val="28"/>
           <w:szCs w:val="28"/>
         </w:rPr>
-        <w:t xml:space="preserve">5. Summary of Questions</w:t>
+        <w:t xml:space="preserve">5. Summary of Requirements</w:t>
       </w:r>
     </w:p>
     <w:tbl>
@@ -1105,13 +1321,14 @@
         </w:tblBorders>
       </w:tblPr>
       <w:tblGrid>
-        <w:gridCol w:w="4680"/>
-        <w:gridCol w:w="4680"/>
+        <w:gridCol w:w="3120"/>
+        <w:gridCol w:w="3120"/>
+        <w:gridCol w:w="3120"/>
       </w:tblGrid>
       <w:tr>
         <w:tc>
           <w:tcPr>
-            <w:tcW w:type="dxa" w:w="4680"/>
+            <w:tcW w:type="dxa" w:w="3120"/>
             <w:tcBorders>
               <w:top w:val="single" w:color="CCCCCC" w:sz="1"/>
               <w:left w:val="single" w:color="CCCCCC" w:sz="1"/>
@@ -1142,7 +1359,7 @@
         </w:tc>
         <w:tc>
           <w:tcPr>
-            <w:tcW w:type="dxa" w:w="4680"/>
+            <w:tcW w:type="dxa" w:w="3120"/>
             <w:tcBorders>
               <w:top w:val="single" w:color="CCCCCC" w:sz="1"/>
               <w:left w:val="single" w:color="CCCCCC" w:sz="1"/>
@@ -1167,7 +1384,38 @@
                 <w:sz w:val="20"/>
                 <w:szCs w:val="20"/>
               </w:rPr>
-              <w:t xml:space="preserve">Question</w:t>
+              <w:t xml:space="preserve">Item</w:t>
+            </w:r>
+          </w:p>
+        </w:tc>
+        <w:tc>
+          <w:tcPr>
+            <w:tcW w:type="dxa" w:w="3120"/>
+            <w:tcBorders>
+              <w:top w:val="single" w:color="CCCCCC" w:sz="1"/>
+              <w:left w:val="single" w:color="CCCCCC" w:sz="1"/>
+              <w:bottom w:val="single" w:color="CCCCCC" w:sz="1"/>
+              <w:right w:val="single" w:color="CCCCCC" w:sz="1"/>
+            </w:tcBorders>
+            <w:shd w:fill="2E4057" w:val="clear"/>
+            <w:tcMar>
+              <w:top w:type="dxa" w:w="80"/>
+              <w:left w:type="dxa" w:w="120"/>
+              <w:bottom w:type="dxa" w:w="80"/>
+              <w:right w:type="dxa" w:w="120"/>
+            </w:tcMar>
+          </w:tcPr>
+          <w:p>
+            <w:r>
+              <w:rPr>
+                <w:rFonts w:ascii="Arial" w:cs="Arial" w:eastAsia="Arial" w:hAnsi="Arial"/>
+                <w:b/>
+                <w:bCs/>
+                <w:color w:val="FFFFFF"/>
+                <w:sz w:val="20"/>
+                <w:szCs w:val="20"/>
+              </w:rPr>
+              <w:t xml:space="preserve">Required</w:t>
             </w:r>
           </w:p>
         </w:tc>
@@ -1175,7 +1423,7 @@
       <w:tr>
         <w:tc>
           <w:tcPr>
-            <w:tcW w:type="dxa" w:w="4680"/>
+            <w:tcW w:type="dxa" w:w="3120"/>
             <w:tcBorders>
               <w:top w:val="single" w:color="CCCCCC" w:sz="1"/>
               <w:left w:val="single" w:color="CCCCCC" w:sz="1"/>
@@ -1206,32 +1454,63 @@
         </w:tc>
         <w:tc>
           <w:tcPr>
-            <w:tcW w:type="dxa" w:w="4680"/>
-            <w:tcBorders>
-              <w:top w:val="single" w:color="CCCCCC" w:sz="1"/>
-              <w:left w:val="single" w:color="CCCCCC" w:sz="1"/>
-              <w:bottom w:val="single" w:color="CCCCCC" w:sz="1"/>
-              <w:right w:val="single" w:color="CCCCCC" w:sz="1"/>
-            </w:tcBorders>
-            <w:shd w:fill="FFFFFF" w:val="clear"/>
-            <w:tcMar>
-              <w:top w:type="dxa" w:w="80"/>
-              <w:left w:type="dxa" w:w="120"/>
-              <w:bottom w:type="dxa" w:w="80"/>
-              <w:right w:type="dxa" w:w="120"/>
-            </w:tcMar>
-          </w:tcPr>
-          <w:p>
-            <w:r>
-              <w:rPr>
-                <w:rFonts w:ascii="Arial" w:cs="Arial" w:eastAsia="Arial" w:hAnsi="Arial"/>
-                <w:b w:val="false"/>
-                <w:bCs w:val="false"/>
-                <w:color w:val="000000"/>
-                <w:sz w:val="20"/>
-                <w:szCs w:val="20"/>
-              </w:rPr>
-              <w:t xml:space="preserve">What is the URL format for the driver booking approval page?</w:t>
+            <w:tcW w:type="dxa" w:w="3120"/>
+            <w:tcBorders>
+              <w:top w:val="single" w:color="CCCCCC" w:sz="1"/>
+              <w:left w:val="single" w:color="CCCCCC" w:sz="1"/>
+              <w:bottom w:val="single" w:color="CCCCCC" w:sz="1"/>
+              <w:right w:val="single" w:color="CCCCCC" w:sz="1"/>
+            </w:tcBorders>
+            <w:shd w:fill="FFFFFF" w:val="clear"/>
+            <w:tcMar>
+              <w:top w:type="dxa" w:w="80"/>
+              <w:left w:type="dxa" w:w="120"/>
+              <w:bottom w:type="dxa" w:w="80"/>
+              <w:right w:type="dxa" w:w="120"/>
+            </w:tcMar>
+          </w:tcPr>
+          <w:p>
+            <w:r>
+              <w:rPr>
+                <w:rFonts w:ascii="Arial" w:cs="Arial" w:eastAsia="Arial" w:hAnsi="Arial"/>
+                <w:b w:val="false"/>
+                <w:bCs w:val="false"/>
+                <w:color w:val="000000"/>
+                <w:sz w:val="20"/>
+                <w:szCs w:val="20"/>
+              </w:rPr>
+              <w:t xml:space="preserve">Booking approval page URL format</w:t>
+            </w:r>
+          </w:p>
+        </w:tc>
+        <w:tc>
+          <w:tcPr>
+            <w:tcW w:type="dxa" w:w="3120"/>
+            <w:tcBorders>
+              <w:top w:val="single" w:color="CCCCCC" w:sz="1"/>
+              <w:left w:val="single" w:color="CCCCCC" w:sz="1"/>
+              <w:bottom w:val="single" w:color="CCCCCC" w:sz="1"/>
+              <w:right w:val="single" w:color="CCCCCC" w:sz="1"/>
+            </w:tcBorders>
+            <w:shd w:fill="FFFFFF" w:val="clear"/>
+            <w:tcMar>
+              <w:top w:type="dxa" w:w="80"/>
+              <w:left w:type="dxa" w:w="120"/>
+              <w:bottom w:type="dxa" w:w="80"/>
+              <w:right w:type="dxa" w:w="120"/>
+            </w:tcMar>
+          </w:tcPr>
+          <w:p>
+            <w:r>
+              <w:rPr>
+                <w:rFonts w:ascii="Arial" w:cs="Arial" w:eastAsia="Arial" w:hAnsi="Arial"/>
+                <w:b w:val="false"/>
+                <w:bCs w:val="false"/>
+                <w:color w:val="000000"/>
+                <w:sz w:val="20"/>
+                <w:szCs w:val="20"/>
+              </w:rPr>
+              <w:t xml:space="preserve">Yes</w:t>
             </w:r>
           </w:p>
         </w:tc>
@@ -1239,7 +1518,7 @@
       <w:tr>
         <w:tc>
           <w:tcPr>
-            <w:tcW w:type="dxa" w:w="4680"/>
+            <w:tcW w:type="dxa" w:w="3120"/>
             <w:tcBorders>
               <w:top w:val="single" w:color="CCCCCC" w:sz="1"/>
               <w:left w:val="single" w:color="CCCCCC" w:sz="1"/>
@@ -1270,32 +1549,63 @@
         </w:tc>
         <w:tc>
           <w:tcPr>
-            <w:tcW w:type="dxa" w:w="4680"/>
-            <w:tcBorders>
-              <w:top w:val="single" w:color="CCCCCC" w:sz="1"/>
-              <w:left w:val="single" w:color="CCCCCC" w:sz="1"/>
-              <w:bottom w:val="single" w:color="CCCCCC" w:sz="1"/>
-              <w:right w:val="single" w:color="CCCCCC" w:sz="1"/>
-            </w:tcBorders>
-            <w:shd w:fill="FFFFFF" w:val="clear"/>
-            <w:tcMar>
-              <w:top w:type="dxa" w:w="80"/>
-              <w:left w:type="dxa" w:w="120"/>
-              <w:bottom w:type="dxa" w:w="80"/>
-              <w:right w:type="dxa" w:w="120"/>
-            </w:tcMar>
-          </w:tcPr>
-          <w:p>
-            <w:r>
-              <w:rPr>
-                <w:rFonts w:ascii="Arial" w:cs="Arial" w:eastAsia="Arial" w:hAnsi="Arial"/>
-                <w:b w:val="false"/>
-                <w:bCs w:val="false"/>
-                <w:color w:val="000000"/>
-                <w:sz w:val="20"/>
-                <w:szCs w:val="20"/>
-              </w:rPr>
-              <w:t xml:space="preserve">Does it require a token or signed parameter?</w:t>
+            <w:tcW w:type="dxa" w:w="3120"/>
+            <w:tcBorders>
+              <w:top w:val="single" w:color="CCCCCC" w:sz="1"/>
+              <w:left w:val="single" w:color="CCCCCC" w:sz="1"/>
+              <w:bottom w:val="single" w:color="CCCCCC" w:sz="1"/>
+              <w:right w:val="single" w:color="CCCCCC" w:sz="1"/>
+            </w:tcBorders>
+            <w:shd w:fill="FFFFFF" w:val="clear"/>
+            <w:tcMar>
+              <w:top w:type="dxa" w:w="80"/>
+              <w:left w:type="dxa" w:w="120"/>
+              <w:bottom w:type="dxa" w:w="80"/>
+              <w:right w:type="dxa" w:w="120"/>
+            </w:tcMar>
+          </w:tcPr>
+          <w:p>
+            <w:r>
+              <w:rPr>
+                <w:rFonts w:ascii="Arial" w:cs="Arial" w:eastAsia="Arial" w:hAnsi="Arial"/>
+                <w:b w:val="false"/>
+                <w:bCs w:val="false"/>
+                <w:color w:val="000000"/>
+                <w:sz w:val="20"/>
+                <w:szCs w:val="20"/>
+              </w:rPr>
+              <w:t xml:space="preserve">Token / auth parameter for the link (if any)</w:t>
+            </w:r>
+          </w:p>
+        </w:tc>
+        <w:tc>
+          <w:tcPr>
+            <w:tcW w:type="dxa" w:w="3120"/>
+            <w:tcBorders>
+              <w:top w:val="single" w:color="CCCCCC" w:sz="1"/>
+              <w:left w:val="single" w:color="CCCCCC" w:sz="1"/>
+              <w:bottom w:val="single" w:color="CCCCCC" w:sz="1"/>
+              <w:right w:val="single" w:color="CCCCCC" w:sz="1"/>
+            </w:tcBorders>
+            <w:shd w:fill="FFFFFF" w:val="clear"/>
+            <w:tcMar>
+              <w:top w:type="dxa" w:w="80"/>
+              <w:left w:type="dxa" w:w="120"/>
+              <w:bottom w:type="dxa" w:w="80"/>
+              <w:right w:type="dxa" w:w="120"/>
+            </w:tcMar>
+          </w:tcPr>
+          <w:p>
+            <w:r>
+              <w:rPr>
+                <w:rFonts w:ascii="Arial" w:cs="Arial" w:eastAsia="Arial" w:hAnsi="Arial"/>
+                <w:b w:val="false"/>
+                <w:bCs w:val="false"/>
+                <w:color w:val="000000"/>
+                <w:sz w:val="20"/>
+                <w:szCs w:val="20"/>
+              </w:rPr>
+              <w:t xml:space="preserve">Yes</w:t>
             </w:r>
           </w:p>
         </w:tc>
@@ -1303,7 +1613,7 @@
       <w:tr>
         <w:tc>
           <w:tcPr>
-            <w:tcW w:type="dxa" w:w="4680"/>
+            <w:tcW w:type="dxa" w:w="3120"/>
             <w:tcBorders>
               <w:top w:val="single" w:color="CCCCCC" w:sz="1"/>
               <w:left w:val="single" w:color="CCCCCC" w:sz="1"/>
@@ -1334,32 +1644,63 @@
         </w:tc>
         <w:tc>
           <w:tcPr>
-            <w:tcW w:type="dxa" w:w="4680"/>
-            <w:tcBorders>
-              <w:top w:val="single" w:color="CCCCCC" w:sz="1"/>
-              <w:left w:val="single" w:color="CCCCCC" w:sz="1"/>
-              <w:bottom w:val="single" w:color="CCCCCC" w:sz="1"/>
-              <w:right w:val="single" w:color="CCCCCC" w:sz="1"/>
-            </w:tcBorders>
-            <w:shd w:fill="FFFFFF" w:val="clear"/>
-            <w:tcMar>
-              <w:top w:type="dxa" w:w="80"/>
-              <w:left w:type="dxa" w:w="120"/>
-              <w:bottom w:type="dxa" w:w="80"/>
-              <w:right w:type="dxa" w:w="120"/>
-            </w:tcMar>
-          </w:tcPr>
-          <w:p>
-            <w:r>
-              <w:rPr>
-                <w:rFonts w:ascii="Arial" w:cs="Arial" w:eastAsia="Arial" w:hAnsi="Arial"/>
-                <w:b w:val="false"/>
-                <w:bCs w:val="false"/>
-                <w:color w:val="000000"/>
-                <w:sz w:val="20"/>
-                <w:szCs w:val="20"/>
-              </w:rPr>
-              <w:t xml:space="preserve">Does clicking Approve in Ride Control automatically confirm the booking?</w:t>
+            <w:tcW w:type="dxa" w:w="3120"/>
+            <w:tcBorders>
+              <w:top w:val="single" w:color="CCCCCC" w:sz="1"/>
+              <w:left w:val="single" w:color="CCCCCC" w:sz="1"/>
+              <w:bottom w:val="single" w:color="CCCCCC" w:sz="1"/>
+              <w:right w:val="single" w:color="CCCCCC" w:sz="1"/>
+            </w:tcBorders>
+            <w:shd w:fill="FFFFFF" w:val="clear"/>
+            <w:tcMar>
+              <w:top w:type="dxa" w:w="80"/>
+              <w:left w:type="dxa" w:w="120"/>
+              <w:bottom w:type="dxa" w:w="80"/>
+              <w:right w:type="dxa" w:w="120"/>
+            </w:tcMar>
+          </w:tcPr>
+          <w:p>
+            <w:r>
+              <w:rPr>
+                <w:rFonts w:ascii="Arial" w:cs="Arial" w:eastAsia="Arial" w:hAnsi="Arial"/>
+                <w:b w:val="false"/>
+                <w:bCs w:val="false"/>
+                <w:color w:val="000000"/>
+                <w:sz w:val="20"/>
+                <w:szCs w:val="20"/>
+              </w:rPr>
+              <w:t xml:space="preserve">Ride Control marks booking confirmed when driver clicks Approve</w:t>
+            </w:r>
+          </w:p>
+        </w:tc>
+        <w:tc>
+          <w:tcPr>
+            <w:tcW w:type="dxa" w:w="3120"/>
+            <w:tcBorders>
+              <w:top w:val="single" w:color="CCCCCC" w:sz="1"/>
+              <w:left w:val="single" w:color="CCCCCC" w:sz="1"/>
+              <w:bottom w:val="single" w:color="CCCCCC" w:sz="1"/>
+              <w:right w:val="single" w:color="CCCCCC" w:sz="1"/>
+            </w:tcBorders>
+            <w:shd w:fill="FFFFFF" w:val="clear"/>
+            <w:tcMar>
+              <w:top w:type="dxa" w:w="80"/>
+              <w:left w:type="dxa" w:w="120"/>
+              <w:bottom w:type="dxa" w:w="80"/>
+              <w:right w:type="dxa" w:w="120"/>
+            </w:tcMar>
+          </w:tcPr>
+          <w:p>
+            <w:r>
+              <w:rPr>
+                <w:rFonts w:ascii="Arial" w:cs="Arial" w:eastAsia="Arial" w:hAnsi="Arial"/>
+                <w:b w:val="false"/>
+                <w:bCs w:val="false"/>
+                <w:color w:val="000000"/>
+                <w:sz w:val="20"/>
+                <w:szCs w:val="20"/>
+              </w:rPr>
+              <w:t xml:space="preserve">Yes</w:t>
             </w:r>
           </w:p>
         </w:tc>
@@ -1367,7 +1708,7 @@
       <w:tr>
         <w:tc>
           <w:tcPr>
-            <w:tcW w:type="dxa" w:w="4680"/>
+            <w:tcW w:type="dxa" w:w="3120"/>
             <w:tcBorders>
               <w:top w:val="single" w:color="CCCCCC" w:sz="1"/>
               <w:left w:val="single" w:color="CCCCCC" w:sz="1"/>
@@ -1398,32 +1739,63 @@
         </w:tc>
         <w:tc>
           <w:tcPr>
-            <w:tcW w:type="dxa" w:w="4680"/>
-            <w:tcBorders>
-              <w:top w:val="single" w:color="CCCCCC" w:sz="1"/>
-              <w:left w:val="single" w:color="CCCCCC" w:sz="1"/>
-              <w:bottom w:val="single" w:color="CCCCCC" w:sz="1"/>
-              <w:right w:val="single" w:color="CCCCCC" w:sz="1"/>
-            </w:tcBorders>
-            <w:shd w:fill="FFFFFF" w:val="clear"/>
-            <w:tcMar>
-              <w:top w:type="dxa" w:w="80"/>
-              <w:left w:type="dxa" w:w="120"/>
-              <w:bottom w:type="dxa" w:w="80"/>
-              <w:right w:type="dxa" w:w="120"/>
-            </w:tcMar>
-          </w:tcPr>
-          <w:p>
-            <w:r>
-              <w:rPr>
-                <w:rFonts w:ascii="Arial" w:cs="Arial" w:eastAsia="Arial" w:hAnsi="Arial"/>
-                <w:b w:val="false"/>
-                <w:bCs w:val="false"/>
-                <w:color w:val="000000"/>
-                <w:sz w:val="20"/>
-                <w:szCs w:val="20"/>
-              </w:rPr>
-              <w:t xml:space="preserve">(Optional) Can Ride Control POST a callback to us when the driver approves/declines?</w:t>
+            <w:tcW w:type="dxa" w:w="3120"/>
+            <w:tcBorders>
+              <w:top w:val="single" w:color="CCCCCC" w:sz="1"/>
+              <w:left w:val="single" w:color="CCCCCC" w:sz="1"/>
+              <w:bottom w:val="single" w:color="CCCCCC" w:sz="1"/>
+              <w:right w:val="single" w:color="CCCCCC" w:sz="1"/>
+            </w:tcBorders>
+            <w:shd w:fill="FFFFFF" w:val="clear"/>
+            <w:tcMar>
+              <w:top w:type="dxa" w:w="80"/>
+              <w:left w:type="dxa" w:w="120"/>
+              <w:bottom w:type="dxa" w:w="80"/>
+              <w:right w:type="dxa" w:w="120"/>
+            </w:tcMar>
+          </w:tcPr>
+          <w:p>
+            <w:r>
+              <w:rPr>
+                <w:rFonts w:ascii="Arial" w:cs="Arial" w:eastAsia="Arial" w:hAnsi="Arial"/>
+                <w:b w:val="false"/>
+                <w:bCs w:val="false"/>
+                <w:color w:val="000000"/>
+                <w:sz w:val="20"/>
+                <w:szCs w:val="20"/>
+              </w:rPr>
+              <w:t xml:space="preserve">POST callback to our server on Approve or Decline</w:t>
+            </w:r>
+          </w:p>
+        </w:tc>
+        <w:tc>
+          <w:tcPr>
+            <w:tcW w:type="dxa" w:w="3120"/>
+            <w:tcBorders>
+              <w:top w:val="single" w:color="CCCCCC" w:sz="1"/>
+              <w:left w:val="single" w:color="CCCCCC" w:sz="1"/>
+              <w:bottom w:val="single" w:color="CCCCCC" w:sz="1"/>
+              <w:right w:val="single" w:color="CCCCCC" w:sz="1"/>
+            </w:tcBorders>
+            <w:shd w:fill="FFFFFF" w:val="clear"/>
+            <w:tcMar>
+              <w:top w:type="dxa" w:w="80"/>
+              <w:left w:type="dxa" w:w="120"/>
+              <w:bottom w:type="dxa" w:w="80"/>
+              <w:right w:type="dxa" w:w="120"/>
+            </w:tcMar>
+          </w:tcPr>
+          <w:p>
+            <w:r>
+              <w:rPr>
+                <w:rFonts w:ascii="Arial" w:cs="Arial" w:eastAsia="Arial" w:hAnsi="Arial"/>
+                <w:b w:val="false"/>
+                <w:bCs w:val="false"/>
+                <w:color w:val="000000"/>
+                <w:sz w:val="20"/>
+                <w:szCs w:val="20"/>
+              </w:rPr>
+              <w:t xml:space="preserve">Yes</w:t>
             </w:r>
           </w:p>
         </w:tc>

</xml_diff>